<commit_message>
udpate notes of the attack lab
</commit_message>
<xml_diff>
--- a/CSAPP/Tutorials/Screenshots of Figures of CSAPP2e.docx
+++ b/CSAPP/Tutorials/Screenshots of Figures of CSAPP2e.docx
@@ -341,6 +341,65 @@
     </w:p>
     <w:p>
       <w:pPr>
+        <w:tabs>
+          <w:tab w:val="center" w:pos="4153"/>
+        </w:tabs>
+      </w:pPr>
+      <w:proofErr w:type="spellStart"/>
+      <w:r>
+        <w:rPr>
+          <w:rFonts w:hint="eastAsia"/>
+        </w:rPr>
+        <w:t>movabs</w:t>
+      </w:r>
+      <w:proofErr w:type="spellEnd"/>
+      <w:r>
+        <w:rPr>
+          <w:rFonts w:hint="eastAsia"/>
+        </w:rPr>
+        <w:t xml:space="preserve"> $0x400921fb4d12d84a, $</w:t>
+      </w:r>
+      <w:proofErr w:type="spellStart"/>
+      <w:r>
+        <w:rPr>
+          <w:rFonts w:hint="eastAsia"/>
+        </w:rPr>
+        <w:t>ea</w:t>
+      </w:r>
+      <w:r>
+        <w:rPr>
+          <w:rFonts w:hint="eastAsia"/>
+        </w:rPr>
+        <w:t>x</w:t>
+      </w:r>
+      <w:proofErr w:type="spellEnd"/>
+    </w:p>
+    <w:p>
+      <w:pPr>
+        <w:tabs>
+          <w:tab w:val="center" w:pos="4153"/>
+        </w:tabs>
+        <w:rPr>
+          <w:rFonts w:hint="eastAsia"/>
+        </w:rPr>
+      </w:pPr>
+      <w:proofErr w:type="spellStart"/>
+      <w:r>
+        <w:rPr>
+          <w:rFonts w:hint="eastAsia"/>
+        </w:rPr>
+        <w:t>movabs</w:t>
+      </w:r>
+      <w:proofErr w:type="spellEnd"/>
+      <w:r>
+        <w:rPr>
+          <w:rFonts w:hint="eastAsia"/>
+        </w:rPr>
+        <w:t xml:space="preserve">: move a full 64-bit value or a 64-bit absolute memory address. </w:t>
+      </w:r>
+    </w:p>
+    <w:p>
+      <w:pPr>
         <w:outlineLvl w:val="1"/>
         <w:rPr>
           <w:rFonts w:ascii="Times New Roman" w:hAnsi="Times New Roman" w:cs="Times New Roman"/>
@@ -355,7 +414,25 @@
           <w:sz w:val="24"/>
         </w:rPr>
         <w:lastRenderedPageBreak/>
-        <w:t>Integer Arithemetic Operation</w:t>
+        <w:t xml:space="preserve">Integer </w:t>
+      </w:r>
+      <w:proofErr w:type="spellStart"/>
+      <w:r>
+        <w:rPr>
+          <w:rFonts w:ascii="Times New Roman" w:hAnsi="Times New Roman" w:cs="Times New Roman" w:hint="eastAsia"/>
+          <w:b/>
+          <w:sz w:val="24"/>
+        </w:rPr>
+        <w:t>Arithemetic</w:t>
+      </w:r>
+      <w:proofErr w:type="spellEnd"/>
+      <w:r>
+        <w:rPr>
+          <w:rFonts w:ascii="Times New Roman" w:hAnsi="Times New Roman" w:cs="Times New Roman" w:hint="eastAsia"/>
+          <w:b/>
+          <w:sz w:val="24"/>
+        </w:rPr>
+        <w:t xml:space="preserve"> Operation</w:t>
       </w:r>
       <w:r>
         <w:rPr>
@@ -922,6 +999,7 @@
         </w:rPr>
         <w:t>“</w:t>
       </w:r>
+      <w:proofErr w:type="spellStart"/>
       <w:r>
         <w:rPr>
           <w:rFonts w:hint="eastAsia"/>
@@ -929,6 +1007,7 @@
         </w:rPr>
         <w:t>movl</w:t>
       </w:r>
+      <w:proofErr w:type="spellEnd"/>
       <w:r>
         <w:rPr>
           <w:b/>
@@ -1198,11 +1277,6 @@
       </w:r>
     </w:p>
     <w:p>
-      <w:pPr>
-        <w:rPr>
-          <w:rFonts w:hint="eastAsia"/>
-        </w:rPr>
-      </w:pPr>
       <w:r>
         <w:rPr>
           <w:noProof/>

</xml_diff>

<commit_message>
update note of level 2 of the part 1 of the attack lab: accomplished
</commit_message>
<xml_diff>
--- a/CSAPP/Tutorials/Screenshots of Figures of CSAPP2e.docx
+++ b/CSAPP/Tutorials/Screenshots of Figures of CSAPP2e.docx
@@ -214,39 +214,37 @@
       <w:pPr>
         <w:outlineLvl w:val="1"/>
         <w:rPr>
+          <w:rFonts w:ascii="Times New Roman" w:hAnsi="Times New Roman" w:cs="Times New Roman" w:hint="eastAsia"/>
+          <w:b/>
+          <w:sz w:val="24"/>
+        </w:rPr>
+      </w:pPr>
+      <w:r>
+        <w:rPr>
+          <w:rFonts w:ascii="Times New Roman" w:hAnsi="Times New Roman" w:cs="Times New Roman" w:hint="eastAsia"/>
+          <w:b/>
+          <w:sz w:val="24"/>
+        </w:rPr>
+        <w:t>Argument Passing (x86-64)</w:t>
+      </w:r>
+    </w:p>
+    <w:p>
+      <w:pPr>
+        <w:rPr>
           <w:rFonts w:ascii="Times New Roman" w:hAnsi="Times New Roman" w:cs="Times New Roman"/>
-          <w:b/>
-          <w:sz w:val="24"/>
-        </w:rPr>
-      </w:pPr>
-      <w:r>
-        <w:rPr>
-          <w:rFonts w:ascii="Times New Roman" w:hAnsi="Times New Roman" w:cs="Times New Roman" w:hint="eastAsia"/>
-          <w:b/>
-          <w:sz w:val="24"/>
-        </w:rPr>
-        <w:t xml:space="preserve">Data Movement Instructions. </w:t>
-      </w:r>
-      <w:r>
-        <w:rPr>
-          <w:rFonts w:ascii="Times New Roman" w:hAnsi="Times New Roman" w:cs="Times New Roman"/>
-          <w:b/>
-          <w:sz w:val="24"/>
-        </w:rPr>
-        <w:t>Page 205</w:t>
-      </w:r>
-    </w:p>
-    <w:p>
+          <w:sz w:val="24"/>
+        </w:rPr>
+      </w:pPr>
       <w:r>
         <w:rPr>
           <w:noProof/>
         </w:rPr>
         <w:lastRenderedPageBreak/>
         <w:drawing>
-          <wp:inline distT="0" distB="0" distL="0" distR="0" wp14:anchorId="2923715B" wp14:editId="277459DE">
-            <wp:extent cx="5274310" cy="3681639"/>
+          <wp:inline distT="0" distB="0" distL="0" distR="0" wp14:anchorId="4ED79D60" wp14:editId="13B96139">
+            <wp:extent cx="5274310" cy="1946910"/>
             <wp:effectExtent l="0" t="0" r="2540" b="0"/>
-            <wp:docPr id="1" name="图片 1"/>
+            <wp:docPr id="2005569020" name="Picture 1"/>
             <wp:cNvGraphicFramePr>
               <a:graphicFrameLocks xmlns:a="http://schemas.openxmlformats.org/drawingml/2006/main" noChangeAspect="1"/>
             </wp:cNvGraphicFramePr>
@@ -254,7 +252,7 @@
               <a:graphicData uri="http://schemas.openxmlformats.org/drawingml/2006/picture">
                 <pic:pic xmlns:pic="http://schemas.openxmlformats.org/drawingml/2006/picture">
                   <pic:nvPicPr>
-                    <pic:cNvPr id="0" name=""/>
+                    <pic:cNvPr id="2005569020" name=""/>
                     <pic:cNvPicPr/>
                   </pic:nvPicPr>
                   <pic:blipFill>
@@ -266,7 +264,7 @@
                   <pic:spPr>
                     <a:xfrm>
                       <a:off x="0" y="0"/>
-                      <a:ext cx="5274310" cy="3681639"/>
+                      <a:ext cx="5274310" cy="1946910"/>
                     </a:xfrm>
                     <a:prstGeom prst="rect">
                       <a:avLst/>
@@ -281,6 +279,21 @@
     </w:p>
     <w:p>
       <w:pPr>
+        <w:rPr>
+          <w:rFonts w:ascii="Times New Roman" w:hAnsi="Times New Roman" w:cs="Times New Roman" w:hint="eastAsia"/>
+          <w:sz w:val="24"/>
+        </w:rPr>
+      </w:pPr>
+      <w:r>
+        <w:rPr>
+          <w:rFonts w:ascii="Times New Roman" w:hAnsi="Times New Roman" w:cs="Times New Roman" w:hint="eastAsia"/>
+          <w:sz w:val="24"/>
+        </w:rPr>
+        <w:t xml:space="preserve">Arguments are passed in specific orders as above. </w:t>
+      </w:r>
+    </w:p>
+    <w:p>
+      <w:pPr>
         <w:outlineLvl w:val="1"/>
         <w:rPr>
           <w:rFonts w:ascii="Times New Roman" w:hAnsi="Times New Roman" w:cs="Times New Roman"/>
@@ -294,7 +307,15 @@
           <w:b/>
           <w:sz w:val="24"/>
         </w:rPr>
-        <w:t>x86-64 Data Movement</w:t>
+        <w:t xml:space="preserve">Data Movement Instructions. </w:t>
+      </w:r>
+      <w:r>
+        <w:rPr>
+          <w:rFonts w:ascii="Times New Roman" w:hAnsi="Times New Roman" w:cs="Times New Roman"/>
+          <w:b/>
+          <w:sz w:val="24"/>
+        </w:rPr>
+        <w:t>Page 205</w:t>
       </w:r>
     </w:p>
     <w:p>
@@ -303,10 +324,10 @@
           <w:noProof/>
         </w:rPr>
         <w:drawing>
-          <wp:inline distT="0" distB="0" distL="0" distR="0" wp14:anchorId="6FA13BB8" wp14:editId="5E31DA72">
-            <wp:extent cx="5274310" cy="3808003"/>
-            <wp:effectExtent l="0" t="0" r="2540" b="2540"/>
-            <wp:docPr id="14" name="图片 14"/>
+          <wp:inline distT="0" distB="0" distL="0" distR="0" wp14:anchorId="2923715B" wp14:editId="277459DE">
+            <wp:extent cx="5274310" cy="3681639"/>
+            <wp:effectExtent l="0" t="0" r="2540" b="0"/>
+            <wp:docPr id="1" name="图片 1"/>
             <wp:cNvGraphicFramePr>
               <a:graphicFrameLocks xmlns:a="http://schemas.openxmlformats.org/drawingml/2006/main" noChangeAspect="1"/>
             </wp:cNvGraphicFramePr>
@@ -326,7 +347,7 @@
                   <pic:spPr>
                     <a:xfrm>
                       <a:off x="0" y="0"/>
-                      <a:ext cx="5274310" cy="3808003"/>
+                      <a:ext cx="5274310" cy="3681639"/>
                     </a:xfrm>
                     <a:prstGeom prst="rect">
                       <a:avLst/>
@@ -341,65 +362,6 @@
     </w:p>
     <w:p>
       <w:pPr>
-        <w:tabs>
-          <w:tab w:val="center" w:pos="4153"/>
-        </w:tabs>
-      </w:pPr>
-      <w:proofErr w:type="spellStart"/>
-      <w:r>
-        <w:rPr>
-          <w:rFonts w:hint="eastAsia"/>
-        </w:rPr>
-        <w:t>movabs</w:t>
-      </w:r>
-      <w:proofErr w:type="spellEnd"/>
-      <w:r>
-        <w:rPr>
-          <w:rFonts w:hint="eastAsia"/>
-        </w:rPr>
-        <w:t xml:space="preserve"> $0x400921fb4d12d84a, $</w:t>
-      </w:r>
-      <w:proofErr w:type="spellStart"/>
-      <w:r>
-        <w:rPr>
-          <w:rFonts w:hint="eastAsia"/>
-        </w:rPr>
-        <w:t>ea</w:t>
-      </w:r>
-      <w:r>
-        <w:rPr>
-          <w:rFonts w:hint="eastAsia"/>
-        </w:rPr>
-        <w:t>x</w:t>
-      </w:r>
-      <w:proofErr w:type="spellEnd"/>
-    </w:p>
-    <w:p>
-      <w:pPr>
-        <w:tabs>
-          <w:tab w:val="center" w:pos="4153"/>
-        </w:tabs>
-        <w:rPr>
-          <w:rFonts w:hint="eastAsia"/>
-        </w:rPr>
-      </w:pPr>
-      <w:proofErr w:type="spellStart"/>
-      <w:r>
-        <w:rPr>
-          <w:rFonts w:hint="eastAsia"/>
-        </w:rPr>
-        <w:t>movabs</w:t>
-      </w:r>
-      <w:proofErr w:type="spellEnd"/>
-      <w:r>
-        <w:rPr>
-          <w:rFonts w:hint="eastAsia"/>
-        </w:rPr>
-        <w:t xml:space="preserve">: move a full 64-bit value or a 64-bit absolute memory address. </w:t>
-      </w:r>
-    </w:p>
-    <w:p>
-      <w:pPr>
         <w:outlineLvl w:val="1"/>
         <w:rPr>
           <w:rFonts w:ascii="Times New Roman" w:hAnsi="Times New Roman" w:cs="Times New Roman"/>
@@ -413,36 +375,20 @@
           <w:b/>
           <w:sz w:val="24"/>
         </w:rPr>
+        <w:t>x86-64 Data Movement</w:t>
+      </w:r>
+    </w:p>
+    <w:p>
+      <w:r>
+        <w:rPr>
+          <w:noProof/>
+        </w:rPr>
         <w:lastRenderedPageBreak/>
-        <w:t xml:space="preserve">Integer </w:t>
-      </w:r>
-      <w:proofErr w:type="spellStart"/>
-      <w:r>
-        <w:rPr>
-          <w:rFonts w:ascii="Times New Roman" w:hAnsi="Times New Roman" w:cs="Times New Roman" w:hint="eastAsia"/>
-          <w:b/>
-          <w:sz w:val="24"/>
-        </w:rPr>
-        <w:t>Arithemetic</w:t>
-      </w:r>
-      <w:proofErr w:type="spellEnd"/>
-      <w:r>
-        <w:rPr>
-          <w:rFonts w:ascii="Times New Roman" w:hAnsi="Times New Roman" w:cs="Times New Roman" w:hint="eastAsia"/>
-          <w:b/>
-          <w:sz w:val="24"/>
-        </w:rPr>
-        <w:t xml:space="preserve"> Operation</w:t>
-      </w:r>
-      <w:r>
-        <w:rPr>
-          <w:noProof/>
-        </w:rPr>
         <w:drawing>
-          <wp:inline distT="0" distB="0" distL="0" distR="0" wp14:anchorId="3E451F07" wp14:editId="0E7A06B7">
-            <wp:extent cx="5274310" cy="4281714"/>
-            <wp:effectExtent l="0" t="0" r="2540" b="5080"/>
-            <wp:docPr id="2" name="图片 2"/>
+          <wp:inline distT="0" distB="0" distL="0" distR="0" wp14:anchorId="6FA13BB8" wp14:editId="5E31DA72">
+            <wp:extent cx="5274310" cy="3808003"/>
+            <wp:effectExtent l="0" t="0" r="2540" b="2540"/>
+            <wp:docPr id="14" name="图片 14"/>
             <wp:cNvGraphicFramePr>
               <a:graphicFrameLocks xmlns:a="http://schemas.openxmlformats.org/drawingml/2006/main" noChangeAspect="1"/>
             </wp:cNvGraphicFramePr>
@@ -462,7 +408,7 @@
                   <pic:spPr>
                     <a:xfrm>
                       <a:off x="0" y="0"/>
-                      <a:ext cx="5274310" cy="4281714"/>
+                      <a:ext cx="5274310" cy="3808003"/>
                     </a:xfrm>
                     <a:prstGeom prst="rect">
                       <a:avLst/>
@@ -477,44 +423,105 @@
     </w:p>
     <w:p>
       <w:pPr>
+        <w:tabs>
+          <w:tab w:val="center" w:pos="4153"/>
+        </w:tabs>
+      </w:pPr>
+      <w:proofErr w:type="spellStart"/>
+      <w:r>
+        <w:rPr>
+          <w:rFonts w:hint="eastAsia"/>
+        </w:rPr>
+        <w:t>movabs</w:t>
+      </w:r>
+      <w:proofErr w:type="spellEnd"/>
+      <w:r>
+        <w:rPr>
+          <w:rFonts w:hint="eastAsia"/>
+        </w:rPr>
+        <w:t xml:space="preserve"> $0x400921fb4d12d84a, $</w:t>
+      </w:r>
+      <w:proofErr w:type="spellStart"/>
+      <w:r>
+        <w:rPr>
+          <w:rFonts w:hint="eastAsia"/>
+        </w:rPr>
+        <w:t>ea</w:t>
+      </w:r>
+      <w:r>
+        <w:rPr>
+          <w:rFonts w:hint="eastAsia"/>
+        </w:rPr>
+        <w:t>x</w:t>
+      </w:r>
+      <w:proofErr w:type="spellEnd"/>
+    </w:p>
+    <w:p>
+      <w:pPr>
+        <w:tabs>
+          <w:tab w:val="center" w:pos="4153"/>
+        </w:tabs>
+      </w:pPr>
+      <w:proofErr w:type="spellStart"/>
+      <w:r>
+        <w:rPr>
+          <w:rFonts w:hint="eastAsia"/>
+        </w:rPr>
+        <w:t>movabs</w:t>
+      </w:r>
+      <w:proofErr w:type="spellEnd"/>
+      <w:r>
+        <w:rPr>
+          <w:rFonts w:hint="eastAsia"/>
+        </w:rPr>
+        <w:t xml:space="preserve">: move a full 64-bit value or a 64-bit absolute memory address. </w:t>
+      </w:r>
+    </w:p>
+    <w:p>
+      <w:pPr>
         <w:outlineLvl w:val="1"/>
         <w:rPr>
           <w:rFonts w:ascii="Times New Roman" w:hAnsi="Times New Roman" w:cs="Times New Roman"/>
           <w:b/>
-        </w:rPr>
-      </w:pPr>
-      <w:r>
-        <w:rPr>
-          <w:rFonts w:ascii="Times New Roman" w:hAnsi="Times New Roman" w:cs="Times New Roman" w:hint="eastAsia"/>
-          <w:b/>
-        </w:rPr>
-        <w:t>Conditional Codes</w:t>
-      </w:r>
-      <w:r>
-        <w:rPr>
-          <w:rFonts w:ascii="Times New Roman" w:hAnsi="Times New Roman" w:cs="Times New Roman" w:hint="eastAsia"/>
-          <w:b/>
-        </w:rPr>
-        <w:t xml:space="preserve">  (Page 219)</w:t>
-      </w:r>
-    </w:p>
-    <w:p>
-      <w:pPr>
-        <w:rPr>
-          <w:rFonts w:ascii="Times New Roman" w:hAnsi="Times New Roman" w:cs="Times New Roman"/>
-          <w:b/>
-          <w:sz w:val="24"/>
-        </w:rPr>
-      </w:pPr>
+          <w:sz w:val="24"/>
+        </w:rPr>
+      </w:pPr>
+      <w:r>
+        <w:rPr>
+          <w:rFonts w:ascii="Times New Roman" w:hAnsi="Times New Roman" w:cs="Times New Roman" w:hint="eastAsia"/>
+          <w:b/>
+          <w:sz w:val="24"/>
+        </w:rPr>
+        <w:lastRenderedPageBreak/>
+        <w:t xml:space="preserve">Integer </w:t>
+      </w:r>
+      <w:proofErr w:type="spellStart"/>
+      <w:r>
+        <w:rPr>
+          <w:rFonts w:ascii="Times New Roman" w:hAnsi="Times New Roman" w:cs="Times New Roman" w:hint="eastAsia"/>
+          <w:b/>
+          <w:sz w:val="24"/>
+        </w:rPr>
+        <w:t>Arithemetic</w:t>
+      </w:r>
+      <w:proofErr w:type="spellEnd"/>
+      <w:r>
+        <w:rPr>
+          <w:rFonts w:ascii="Times New Roman" w:hAnsi="Times New Roman" w:cs="Times New Roman" w:hint="eastAsia"/>
+          <w:b/>
+          <w:sz w:val="24"/>
+        </w:rPr>
+        <w:t xml:space="preserve"> Operation</w:t>
+      </w:r>
       <w:r>
         <w:rPr>
           <w:noProof/>
         </w:rPr>
         <w:drawing>
-          <wp:inline distT="0" distB="0" distL="0" distR="0" wp14:anchorId="191CE508" wp14:editId="6A7F5491">
-            <wp:extent cx="5274310" cy="2370621"/>
-            <wp:effectExtent l="0" t="0" r="2540" b="0"/>
-            <wp:docPr id="5" name="图片 5"/>
+          <wp:inline distT="0" distB="0" distL="0" distR="0" wp14:anchorId="3E451F07" wp14:editId="0E7A06B7">
+            <wp:extent cx="5274310" cy="4281714"/>
+            <wp:effectExtent l="0" t="0" r="2540" b="5080"/>
+            <wp:docPr id="2" name="图片 2"/>
             <wp:cNvGraphicFramePr>
               <a:graphicFrameLocks xmlns:a="http://schemas.openxmlformats.org/drawingml/2006/main" noChangeAspect="1"/>
             </wp:cNvGraphicFramePr>
@@ -534,7 +541,7 @@
                   <pic:spPr>
                     <a:xfrm>
                       <a:off x="0" y="0"/>
-                      <a:ext cx="5274310" cy="2370621"/>
+                      <a:ext cx="5274310" cy="4281714"/>
                     </a:xfrm>
                     <a:prstGeom prst="rect">
                       <a:avLst/>
@@ -560,7 +567,14 @@
           <w:rFonts w:ascii="Times New Roman" w:hAnsi="Times New Roman" w:cs="Times New Roman" w:hint="eastAsia"/>
           <w:b/>
         </w:rPr>
-        <w:t>The SET instructions</w:t>
+        <w:t>Conditional Codes</w:t>
+      </w:r>
+      <w:r>
+        <w:rPr>
+          <w:rFonts w:ascii="Times New Roman" w:hAnsi="Times New Roman" w:cs="Times New Roman" w:hint="eastAsia"/>
+          <w:b/>
+        </w:rPr>
+        <w:t xml:space="preserve">  (Page 219)</w:t>
       </w:r>
     </w:p>
     <w:p>
@@ -575,12 +589,11 @@
         <w:rPr>
           <w:noProof/>
         </w:rPr>
-        <w:lastRenderedPageBreak/>
         <w:drawing>
-          <wp:inline distT="0" distB="0" distL="0" distR="0" wp14:anchorId="5855F4A5" wp14:editId="6CBBD1DB">
-            <wp:extent cx="5190476" cy="3485714"/>
-            <wp:effectExtent l="0" t="0" r="0" b="635"/>
-            <wp:docPr id="6" name="图片 6"/>
+          <wp:inline distT="0" distB="0" distL="0" distR="0" wp14:anchorId="191CE508" wp14:editId="6A7F5491">
+            <wp:extent cx="5274310" cy="2370621"/>
+            <wp:effectExtent l="0" t="0" r="2540" b="0"/>
+            <wp:docPr id="5" name="图片 5"/>
             <wp:cNvGraphicFramePr>
               <a:graphicFrameLocks xmlns:a="http://schemas.openxmlformats.org/drawingml/2006/main" noChangeAspect="1"/>
             </wp:cNvGraphicFramePr>
@@ -600,7 +613,7 @@
                   <pic:spPr>
                     <a:xfrm>
                       <a:off x="0" y="0"/>
-                      <a:ext cx="5190476" cy="3485714"/>
+                      <a:ext cx="5274310" cy="2370621"/>
                     </a:xfrm>
                     <a:prstGeom prst="rect">
                       <a:avLst/>
@@ -626,33 +639,27 @@
           <w:rFonts w:ascii="Times New Roman" w:hAnsi="Times New Roman" w:cs="Times New Roman" w:hint="eastAsia"/>
           <w:b/>
         </w:rPr>
-        <w:t>Comparison and test instructions.</w:t>
-      </w:r>
-      <w:r>
-        <w:rPr>
-          <w:rFonts w:ascii="Times New Roman" w:hAnsi="Times New Roman" w:cs="Times New Roman" w:hint="eastAsia"/>
-          <w:b/>
-        </w:rPr>
-        <w:t xml:space="preserve">  </w:t>
-      </w:r>
-      <w:r>
-        <w:rPr>
-          <w:rFonts w:ascii="Times New Roman" w:hAnsi="Times New Roman" w:cs="Times New Roman" w:hint="eastAsia"/>
-          <w:b/>
-        </w:rPr>
-        <w:t>Page 220</w:t>
-      </w:r>
-    </w:p>
-    <w:p>
+        <w:t>The SET instructions</w:t>
+      </w:r>
+    </w:p>
+    <w:p>
+      <w:pPr>
+        <w:rPr>
+          <w:rFonts w:ascii="Times New Roman" w:hAnsi="Times New Roman" w:cs="Times New Roman"/>
+          <w:b/>
+          <w:sz w:val="24"/>
+        </w:rPr>
+      </w:pPr>
       <w:r>
         <w:rPr>
           <w:noProof/>
         </w:rPr>
+        <w:lastRenderedPageBreak/>
         <w:drawing>
-          <wp:inline distT="0" distB="0" distL="0" distR="0" wp14:anchorId="060EC3E8" wp14:editId="7F7E6143">
-            <wp:extent cx="5274310" cy="2380615"/>
-            <wp:effectExtent l="0" t="0" r="2540" b="635"/>
-            <wp:docPr id="4" name="图片 4"/>
+          <wp:inline distT="0" distB="0" distL="0" distR="0" wp14:anchorId="5855F4A5" wp14:editId="6CBBD1DB">
+            <wp:extent cx="5190476" cy="3485714"/>
+            <wp:effectExtent l="0" t="0" r="0" b="635"/>
+            <wp:docPr id="6" name="图片 6"/>
             <wp:cNvGraphicFramePr>
               <a:graphicFrameLocks xmlns:a="http://schemas.openxmlformats.org/drawingml/2006/main" noChangeAspect="1"/>
             </wp:cNvGraphicFramePr>
@@ -672,7 +679,7 @@
                   <pic:spPr>
                     <a:xfrm>
                       <a:off x="0" y="0"/>
-                      <a:ext cx="5274310" cy="2380615"/>
+                      <a:ext cx="5190476" cy="3485714"/>
                     </a:xfrm>
                     <a:prstGeom prst="rect">
                       <a:avLst/>
@@ -698,21 +705,21 @@
           <w:rFonts w:ascii="Times New Roman" w:hAnsi="Times New Roman" w:cs="Times New Roman" w:hint="eastAsia"/>
           <w:b/>
         </w:rPr>
-        <w:t>The jump instructions</w:t>
-      </w:r>
-      <w:r>
-        <w:rPr>
-          <w:rFonts w:ascii="Times New Roman" w:hAnsi="Times New Roman" w:cs="Times New Roman" w:hint="eastAsia"/>
-          <w:b/>
-        </w:rPr>
-        <w:t xml:space="preserve">. </w:t>
-      </w:r>
-      <w:r>
-        <w:rPr>
-          <w:rFonts w:ascii="Times New Roman" w:hAnsi="Times New Roman" w:cs="Times New Roman"/>
-          <w:b/>
-        </w:rPr>
-        <w:t>Page 224</w:t>
+        <w:t>Comparison and test instructions.</w:t>
+      </w:r>
+      <w:r>
+        <w:rPr>
+          <w:rFonts w:ascii="Times New Roman" w:hAnsi="Times New Roman" w:cs="Times New Roman" w:hint="eastAsia"/>
+          <w:b/>
+        </w:rPr>
+        <w:t xml:space="preserve">  </w:t>
+      </w:r>
+      <w:r>
+        <w:rPr>
+          <w:rFonts w:ascii="Times New Roman" w:hAnsi="Times New Roman" w:cs="Times New Roman" w:hint="eastAsia"/>
+          <w:b/>
+        </w:rPr>
+        <w:t>Page 220</w:t>
       </w:r>
     </w:p>
     <w:p>
@@ -720,12 +727,11 @@
         <w:rPr>
           <w:noProof/>
         </w:rPr>
-        <w:lastRenderedPageBreak/>
         <w:drawing>
-          <wp:inline distT="0" distB="0" distL="0" distR="0" wp14:anchorId="38D5A206" wp14:editId="260C4C6C">
-            <wp:extent cx="5274310" cy="3845241"/>
-            <wp:effectExtent l="0" t="0" r="2540" b="3175"/>
-            <wp:docPr id="3" name="图片 3"/>
+          <wp:inline distT="0" distB="0" distL="0" distR="0" wp14:anchorId="060EC3E8" wp14:editId="7F7E6143">
+            <wp:extent cx="5274310" cy="2380615"/>
+            <wp:effectExtent l="0" t="0" r="2540" b="635"/>
+            <wp:docPr id="4" name="图片 4"/>
             <wp:cNvGraphicFramePr>
               <a:graphicFrameLocks xmlns:a="http://schemas.openxmlformats.org/drawingml/2006/main" noChangeAspect="1"/>
             </wp:cNvGraphicFramePr>
@@ -745,7 +751,7 @@
                   <pic:spPr>
                     <a:xfrm>
                       <a:off x="0" y="0"/>
-                      <a:ext cx="5274310" cy="3845241"/>
+                      <a:ext cx="5274310" cy="2380615"/>
                     </a:xfrm>
                     <a:prstGeom prst="rect">
                       <a:avLst/>
@@ -771,7 +777,21 @@
           <w:rFonts w:ascii="Times New Roman" w:hAnsi="Times New Roman" w:cs="Times New Roman" w:hint="eastAsia"/>
           <w:b/>
         </w:rPr>
-        <w:t>Y86 Instruction Set Page 372</w:t>
+        <w:t>The jump instructions</w:t>
+      </w:r>
+      <w:r>
+        <w:rPr>
+          <w:rFonts w:ascii="Times New Roman" w:hAnsi="Times New Roman" w:cs="Times New Roman" w:hint="eastAsia"/>
+          <w:b/>
+        </w:rPr>
+        <w:t xml:space="preserve">. </w:t>
+      </w:r>
+      <w:r>
+        <w:rPr>
+          <w:rFonts w:ascii="Times New Roman" w:hAnsi="Times New Roman" w:cs="Times New Roman"/>
+          <w:b/>
+        </w:rPr>
+        <w:t>Page 224</w:t>
       </w:r>
     </w:p>
     <w:p>
@@ -779,11 +799,12 @@
         <w:rPr>
           <w:noProof/>
         </w:rPr>
+        <w:lastRenderedPageBreak/>
         <w:drawing>
-          <wp:inline distT="0" distB="0" distL="0" distR="0" wp14:anchorId="77A08C79" wp14:editId="65736786">
-            <wp:extent cx="5274310" cy="1990075"/>
-            <wp:effectExtent l="0" t="0" r="2540" b="0"/>
-            <wp:docPr id="11" name="图片 11"/>
+          <wp:inline distT="0" distB="0" distL="0" distR="0" wp14:anchorId="38D5A206" wp14:editId="260C4C6C">
+            <wp:extent cx="5274310" cy="3845241"/>
+            <wp:effectExtent l="0" t="0" r="2540" b="3175"/>
+            <wp:docPr id="3" name="图片 3"/>
             <wp:cNvGraphicFramePr>
               <a:graphicFrameLocks xmlns:a="http://schemas.openxmlformats.org/drawingml/2006/main" noChangeAspect="1"/>
             </wp:cNvGraphicFramePr>
@@ -803,7 +824,7 @@
                   <pic:spPr>
                     <a:xfrm>
                       <a:off x="0" y="0"/>
-                      <a:ext cx="5274310" cy="1990075"/>
+                      <a:ext cx="5274310" cy="3845241"/>
                     </a:xfrm>
                     <a:prstGeom prst="rect">
                       <a:avLst/>
@@ -817,16 +838,31 @@
       </w:r>
     </w:p>
     <w:p>
+      <w:pPr>
+        <w:outlineLvl w:val="1"/>
+        <w:rPr>
+          <w:rFonts w:ascii="Times New Roman" w:hAnsi="Times New Roman" w:cs="Times New Roman"/>
+          <w:b/>
+        </w:rPr>
+      </w:pPr>
+      <w:r>
+        <w:rPr>
+          <w:rFonts w:ascii="Times New Roman" w:hAnsi="Times New Roman" w:cs="Times New Roman" w:hint="eastAsia"/>
+          <w:b/>
+        </w:rPr>
+        <w:t>Y86 Instruction Set Page 372</w:t>
+      </w:r>
+    </w:p>
+    <w:p>
       <w:r>
         <w:rPr>
           <w:noProof/>
         </w:rPr>
-        <w:lastRenderedPageBreak/>
         <w:drawing>
-          <wp:inline distT="0" distB="0" distL="0" distR="0" wp14:anchorId="4624F87E" wp14:editId="77CC2441">
-            <wp:extent cx="5274310" cy="3636466"/>
-            <wp:effectExtent l="0" t="0" r="2540" b="2540"/>
-            <wp:docPr id="8" name="图片 8"/>
+          <wp:inline distT="0" distB="0" distL="0" distR="0" wp14:anchorId="77A08C79" wp14:editId="65736786">
+            <wp:extent cx="5274310" cy="1990075"/>
+            <wp:effectExtent l="0" t="0" r="2540" b="0"/>
+            <wp:docPr id="11" name="图片 11"/>
             <wp:cNvGraphicFramePr>
               <a:graphicFrameLocks xmlns:a="http://schemas.openxmlformats.org/drawingml/2006/main" noChangeAspect="1"/>
             </wp:cNvGraphicFramePr>
@@ -846,7 +882,7 @@
                   <pic:spPr>
                     <a:xfrm>
                       <a:off x="0" y="0"/>
-                      <a:ext cx="5274310" cy="3636466"/>
+                      <a:ext cx="5274310" cy="1990075"/>
                     </a:xfrm>
                     <a:prstGeom prst="rect">
                       <a:avLst/>
@@ -864,11 +900,12 @@
         <w:rPr>
           <w:noProof/>
         </w:rPr>
+        <w:lastRenderedPageBreak/>
         <w:drawing>
-          <wp:inline distT="0" distB="0" distL="0" distR="0" wp14:anchorId="6B6CCE07" wp14:editId="5A17264C">
-            <wp:extent cx="5274310" cy="2264779"/>
+          <wp:inline distT="0" distB="0" distL="0" distR="0" wp14:anchorId="4624F87E" wp14:editId="77CC2441">
+            <wp:extent cx="5274310" cy="3636466"/>
             <wp:effectExtent l="0" t="0" r="2540" b="2540"/>
-            <wp:docPr id="9" name="图片 9"/>
+            <wp:docPr id="8" name="图片 8"/>
             <wp:cNvGraphicFramePr>
               <a:graphicFrameLocks xmlns:a="http://schemas.openxmlformats.org/drawingml/2006/main" noChangeAspect="1"/>
             </wp:cNvGraphicFramePr>
@@ -888,7 +925,7 @@
                   <pic:spPr>
                     <a:xfrm>
                       <a:off x="0" y="0"/>
-                      <a:ext cx="5274310" cy="2264779"/>
+                      <a:ext cx="5274310" cy="3636466"/>
                     </a:xfrm>
                     <a:prstGeom prst="rect">
                       <a:avLst/>
@@ -902,180 +939,15 @@
       </w:r>
     </w:p>
     <w:p>
-      <w:pPr>
-        <w:rPr>
-          <w:b/>
-        </w:rPr>
-      </w:pPr>
-      <w:r>
-        <w:rPr>
-          <w:rFonts w:hint="eastAsia"/>
-          <w:b/>
-        </w:rPr>
-        <w:t xml:space="preserve">Note that in </w:t>
-      </w:r>
-      <w:r>
-        <w:rPr>
-          <w:rFonts w:hint="eastAsia"/>
-          <w:b/>
-        </w:rPr>
-        <w:t xml:space="preserve">the above </w:t>
-      </w:r>
-      <w:r>
-        <w:rPr>
-          <w:rFonts w:hint="eastAsia"/>
-          <w:b/>
-        </w:rPr>
-        <w:t xml:space="preserve">conditional moves </w:t>
-      </w:r>
-      <w:r>
-        <w:rPr>
-          <w:b/>
-        </w:rPr>
-        <w:t>“</w:t>
-      </w:r>
-      <w:r>
-        <w:rPr>
-          <w:rFonts w:hint="eastAsia"/>
-          <w:b/>
-        </w:rPr>
-        <w:t>l</w:t>
-      </w:r>
-      <w:r>
-        <w:rPr>
-          <w:b/>
-        </w:rPr>
-        <w:t>”</w:t>
-      </w:r>
-      <w:r>
-        <w:rPr>
-          <w:rFonts w:hint="eastAsia"/>
-          <w:b/>
-        </w:rPr>
-        <w:t xml:space="preserve"> doesn</w:t>
-      </w:r>
-      <w:r>
-        <w:rPr>
-          <w:b/>
-        </w:rPr>
-        <w:t>’</w:t>
-      </w:r>
-      <w:r>
-        <w:rPr>
-          <w:rFonts w:hint="eastAsia"/>
-          <w:b/>
-        </w:rPr>
-        <w:t xml:space="preserve">t represent </w:t>
-      </w:r>
-      <w:r>
-        <w:rPr>
-          <w:b/>
-        </w:rPr>
-        <w:t>“</w:t>
-      </w:r>
-      <w:r>
-        <w:rPr>
-          <w:rFonts w:hint="eastAsia"/>
-          <w:b/>
-        </w:rPr>
-        <w:t>double words</w:t>
-      </w:r>
-      <w:r>
-        <w:rPr>
-          <w:b/>
-        </w:rPr>
-        <w:t>”</w:t>
-      </w:r>
-      <w:r>
-        <w:rPr>
-          <w:rFonts w:hint="eastAsia"/>
-          <w:b/>
-        </w:rPr>
-        <w:t xml:space="preserve"> as in </w:t>
-      </w:r>
-      <w:r>
-        <w:rPr>
-          <w:b/>
-        </w:rPr>
-        <w:t>“</w:t>
-      </w:r>
-      <w:proofErr w:type="spellStart"/>
-      <w:r>
-        <w:rPr>
-          <w:rFonts w:hint="eastAsia"/>
-          <w:b/>
-        </w:rPr>
-        <w:t>movl</w:t>
-      </w:r>
-      <w:proofErr w:type="spellEnd"/>
-      <w:r>
-        <w:rPr>
-          <w:b/>
-        </w:rPr>
-        <w:t>”</w:t>
-      </w:r>
-      <w:r>
-        <w:rPr>
-          <w:rFonts w:hint="eastAsia"/>
-          <w:b/>
-        </w:rPr>
-        <w:t xml:space="preserve">, but represents </w:t>
-      </w:r>
-      <w:r>
-        <w:rPr>
-          <w:b/>
-        </w:rPr>
-        <w:t>“</w:t>
-      </w:r>
-      <w:r>
-        <w:rPr>
-          <w:rFonts w:hint="eastAsia"/>
-          <w:b/>
-        </w:rPr>
-        <w:t>less</w:t>
-      </w:r>
-      <w:r>
-        <w:rPr>
-          <w:b/>
-        </w:rPr>
-        <w:t>”</w:t>
-      </w:r>
-      <w:r>
-        <w:rPr>
-          <w:rFonts w:hint="eastAsia"/>
-          <w:b/>
-        </w:rPr>
-        <w:t>.</w:t>
-      </w:r>
-    </w:p>
-    <w:p>
-      <w:pPr>
-        <w:outlineLvl w:val="1"/>
-        <w:rPr>
-          <w:rFonts w:ascii="Times New Roman" w:hAnsi="Times New Roman" w:cs="Times New Roman"/>
-          <w:b/>
-        </w:rPr>
-      </w:pPr>
-      <w:r>
-        <w:rPr>
-          <w:rFonts w:ascii="Times New Roman" w:hAnsi="Times New Roman" w:cs="Times New Roman" w:hint="eastAsia"/>
-          <w:b/>
-        </w:rPr>
-        <w:t>Y86 Register Identifiers</w:t>
-      </w:r>
-    </w:p>
-    <w:p/>
-    <w:p>
       <w:r>
         <w:rPr>
           <w:noProof/>
         </w:rPr>
-        <w:lastRenderedPageBreak/>
         <w:drawing>
-          <wp:inline distT="0" distB="0" distL="0" distR="0" wp14:anchorId="7DE6058B" wp14:editId="61D899E9">
-            <wp:extent cx="5274310" cy="2711630"/>
-            <wp:effectExtent l="0" t="0" r="2540" b="0"/>
-            <wp:docPr id="10" name="图片 10"/>
+          <wp:inline distT="0" distB="0" distL="0" distR="0" wp14:anchorId="6B6CCE07" wp14:editId="5A17264C">
+            <wp:extent cx="5274310" cy="2264779"/>
+            <wp:effectExtent l="0" t="0" r="2540" b="2540"/>
+            <wp:docPr id="9" name="图片 9"/>
             <wp:cNvGraphicFramePr>
               <a:graphicFrameLocks xmlns:a="http://schemas.openxmlformats.org/drawingml/2006/main" noChangeAspect="1"/>
             </wp:cNvGraphicFramePr>
@@ -1095,7 +967,7 @@
                   <pic:spPr>
                     <a:xfrm>
                       <a:off x="0" y="0"/>
-                      <a:ext cx="5274310" cy="2711630"/>
+                      <a:ext cx="5274310" cy="2264779"/>
                     </a:xfrm>
                     <a:prstGeom prst="rect">
                       <a:avLst/>
@@ -1110,34 +982,179 @@
     </w:p>
     <w:p>
       <w:pPr>
+        <w:rPr>
+          <w:b/>
+        </w:rPr>
+      </w:pPr>
+      <w:r>
+        <w:rPr>
+          <w:rFonts w:hint="eastAsia"/>
+          <w:b/>
+        </w:rPr>
+        <w:t xml:space="preserve">Note that in </w:t>
+      </w:r>
+      <w:r>
+        <w:rPr>
+          <w:rFonts w:hint="eastAsia"/>
+          <w:b/>
+        </w:rPr>
+        <w:t xml:space="preserve">the above </w:t>
+      </w:r>
+      <w:r>
+        <w:rPr>
+          <w:rFonts w:hint="eastAsia"/>
+          <w:b/>
+        </w:rPr>
+        <w:t xml:space="preserve">conditional moves </w:t>
+      </w:r>
+      <w:r>
+        <w:rPr>
+          <w:b/>
+        </w:rPr>
+        <w:t>“</w:t>
+      </w:r>
+      <w:r>
+        <w:rPr>
+          <w:rFonts w:hint="eastAsia"/>
+          <w:b/>
+        </w:rPr>
+        <w:t>l</w:t>
+      </w:r>
+      <w:r>
+        <w:rPr>
+          <w:b/>
+        </w:rPr>
+        <w:t>”</w:t>
+      </w:r>
+      <w:r>
+        <w:rPr>
+          <w:rFonts w:hint="eastAsia"/>
+          <w:b/>
+        </w:rPr>
+        <w:t xml:space="preserve"> doesn</w:t>
+      </w:r>
+      <w:r>
+        <w:rPr>
+          <w:b/>
+        </w:rPr>
+        <w:t>’</w:t>
+      </w:r>
+      <w:r>
+        <w:rPr>
+          <w:rFonts w:hint="eastAsia"/>
+          <w:b/>
+        </w:rPr>
+        <w:t xml:space="preserve">t represent </w:t>
+      </w:r>
+      <w:r>
+        <w:rPr>
+          <w:b/>
+        </w:rPr>
+        <w:t>“</w:t>
+      </w:r>
+      <w:r>
+        <w:rPr>
+          <w:rFonts w:hint="eastAsia"/>
+          <w:b/>
+        </w:rPr>
+        <w:t>double words</w:t>
+      </w:r>
+      <w:r>
+        <w:rPr>
+          <w:b/>
+        </w:rPr>
+        <w:t>”</w:t>
+      </w:r>
+      <w:r>
+        <w:rPr>
+          <w:rFonts w:hint="eastAsia"/>
+          <w:b/>
+        </w:rPr>
+        <w:t xml:space="preserve"> as in </w:t>
+      </w:r>
+      <w:r>
+        <w:rPr>
+          <w:b/>
+        </w:rPr>
+        <w:t>“</w:t>
+      </w:r>
+      <w:proofErr w:type="spellStart"/>
+      <w:r>
+        <w:rPr>
+          <w:rFonts w:hint="eastAsia"/>
+          <w:b/>
+        </w:rPr>
+        <w:t>movl</w:t>
+      </w:r>
+      <w:proofErr w:type="spellEnd"/>
+      <w:r>
+        <w:rPr>
+          <w:b/>
+        </w:rPr>
+        <w:t>”</w:t>
+      </w:r>
+      <w:r>
+        <w:rPr>
+          <w:rFonts w:hint="eastAsia"/>
+          <w:b/>
+        </w:rPr>
+        <w:t xml:space="preserve">, but represents </w:t>
+      </w:r>
+      <w:r>
+        <w:rPr>
+          <w:b/>
+        </w:rPr>
+        <w:t>“</w:t>
+      </w:r>
+      <w:r>
+        <w:rPr>
+          <w:rFonts w:hint="eastAsia"/>
+          <w:b/>
+        </w:rPr>
+        <w:t>less</w:t>
+      </w:r>
+      <w:r>
+        <w:rPr>
+          <w:b/>
+        </w:rPr>
+        <w:t>”</w:t>
+      </w:r>
+      <w:r>
+        <w:rPr>
+          <w:rFonts w:hint="eastAsia"/>
+          <w:b/>
+        </w:rPr>
+        <w:t>.</w:t>
+      </w:r>
+    </w:p>
+    <w:p>
+      <w:pPr>
         <w:outlineLvl w:val="1"/>
         <w:rPr>
           <w:rFonts w:ascii="Times New Roman" w:hAnsi="Times New Roman" w:cs="Times New Roman"/>
           <w:b/>
-          <w:sz w:val="24"/>
-          <w:szCs w:val="24"/>
-        </w:rPr>
-      </w:pPr>
-      <w:r>
-        <w:rPr>
-          <w:rFonts w:ascii="Times New Roman" w:hAnsi="Times New Roman" w:cs="Times New Roman" w:hint="eastAsia"/>
-          <w:b/>
-          <w:sz w:val="24"/>
-          <w:szCs w:val="24"/>
-        </w:rPr>
-        <w:t xml:space="preserve">Constant Values Used in HCL Descriptions </w:t>
-      </w:r>
-    </w:p>
+        </w:rPr>
+      </w:pPr>
+      <w:r>
+        <w:rPr>
+          <w:rFonts w:ascii="Times New Roman" w:hAnsi="Times New Roman" w:cs="Times New Roman" w:hint="eastAsia"/>
+          <w:b/>
+        </w:rPr>
+        <w:t>Y86 Register Identifiers</w:t>
+      </w:r>
+    </w:p>
+    <w:p/>
     <w:p>
       <w:r>
         <w:rPr>
           <w:noProof/>
         </w:rPr>
+        <w:lastRenderedPageBreak/>
         <w:drawing>
-          <wp:inline distT="0" distB="0" distL="0" distR="0" wp14:anchorId="6C6B9ED1" wp14:editId="0320CB50">
-            <wp:extent cx="5274310" cy="5172364"/>
-            <wp:effectExtent l="0" t="0" r="2540" b="9525"/>
-            <wp:docPr id="15" name="图片 15"/>
+          <wp:inline distT="0" distB="0" distL="0" distR="0" wp14:anchorId="7DE6058B" wp14:editId="61D899E9">
+            <wp:extent cx="5274310" cy="2711630"/>
+            <wp:effectExtent l="0" t="0" r="2540" b="0"/>
+            <wp:docPr id="10" name="图片 10"/>
             <wp:cNvGraphicFramePr>
               <a:graphicFrameLocks xmlns:a="http://schemas.openxmlformats.org/drawingml/2006/main" noChangeAspect="1"/>
             </wp:cNvGraphicFramePr>
@@ -1157,6 +1174,68 @@
                   <pic:spPr>
                     <a:xfrm>
                       <a:off x="0" y="0"/>
+                      <a:ext cx="5274310" cy="2711630"/>
+                    </a:xfrm>
+                    <a:prstGeom prst="rect">
+                      <a:avLst/>
+                    </a:prstGeom>
+                  </pic:spPr>
+                </pic:pic>
+              </a:graphicData>
+            </a:graphic>
+          </wp:inline>
+        </w:drawing>
+      </w:r>
+    </w:p>
+    <w:p>
+      <w:pPr>
+        <w:outlineLvl w:val="1"/>
+        <w:rPr>
+          <w:rFonts w:ascii="Times New Roman" w:hAnsi="Times New Roman" w:cs="Times New Roman"/>
+          <w:b/>
+          <w:sz w:val="24"/>
+          <w:szCs w:val="24"/>
+        </w:rPr>
+      </w:pPr>
+      <w:r>
+        <w:rPr>
+          <w:rFonts w:ascii="Times New Roman" w:hAnsi="Times New Roman" w:cs="Times New Roman" w:hint="eastAsia"/>
+          <w:b/>
+          <w:sz w:val="24"/>
+          <w:szCs w:val="24"/>
+        </w:rPr>
+        <w:t xml:space="preserve">Constant Values Used in HCL Descriptions </w:t>
+      </w:r>
+    </w:p>
+    <w:p>
+      <w:r>
+        <w:rPr>
+          <w:noProof/>
+        </w:rPr>
+        <w:drawing>
+          <wp:inline distT="0" distB="0" distL="0" distR="0" wp14:anchorId="6C6B9ED1" wp14:editId="0320CB50">
+            <wp:extent cx="5274310" cy="5172364"/>
+            <wp:effectExtent l="0" t="0" r="2540" b="9525"/>
+            <wp:docPr id="15" name="图片 15"/>
+            <wp:cNvGraphicFramePr>
+              <a:graphicFrameLocks xmlns:a="http://schemas.openxmlformats.org/drawingml/2006/main" noChangeAspect="1"/>
+            </wp:cNvGraphicFramePr>
+            <a:graphic xmlns:a="http://schemas.openxmlformats.org/drawingml/2006/main">
+              <a:graphicData uri="http://schemas.openxmlformats.org/drawingml/2006/picture">
+                <pic:pic xmlns:pic="http://schemas.openxmlformats.org/drawingml/2006/picture">
+                  <pic:nvPicPr>
+                    <pic:cNvPr id="0" name=""/>
+                    <pic:cNvPicPr/>
+                  </pic:nvPicPr>
+                  <pic:blipFill>
+                    <a:blip r:embed="rId19"/>
+                    <a:stretch>
+                      <a:fillRect/>
+                    </a:stretch>
+                  </pic:blipFill>
+                  <pic:spPr>
+                    <a:xfrm>
+                      <a:off x="0" y="0"/>
                       <a:ext cx="5274310" cy="5172364"/>
                     </a:xfrm>
                     <a:prstGeom prst="rect">
@@ -1213,7 +1292,7 @@
                     <pic:cNvPicPr/>
                   </pic:nvPicPr>
                   <pic:blipFill>
-                    <a:blip r:embed="rId19"/>
+                    <a:blip r:embed="rId20"/>
                     <a:stretch>
                       <a:fillRect/>
                     </a:stretch>
@@ -1255,7 +1334,7 @@
                     <pic:cNvPicPr/>
                   </pic:nvPicPr>
                   <pic:blipFill>
-                    <a:blip r:embed="rId20"/>
+                    <a:blip r:embed="rId21"/>
                     <a:stretch>
                       <a:fillRect/>
                     </a:stretch>
@@ -1298,7 +1377,7 @@
                     <pic:cNvPicPr/>
                   </pic:nvPicPr>
                   <pic:blipFill>
-                    <a:blip r:embed="rId21"/>
+                    <a:blip r:embed="rId22"/>
                     <a:stretch>
                       <a:fillRect/>
                     </a:stretch>

</xml_diff>

<commit_message>
update notes of load or use data hazards
</commit_message>
<xml_diff>
--- a/CSAPP/Tutorials/Screenshots of Figures of CSAPP2e.docx
+++ b/CSAPP/Tutorials/Screenshots of Figures of CSAPP2e.docx
@@ -214,7 +214,7 @@
       <w:pPr>
         <w:outlineLvl w:val="1"/>
         <w:rPr>
-          <w:rFonts w:ascii="Times New Roman" w:hAnsi="Times New Roman" w:cs="Times New Roman" w:hint="eastAsia"/>
+          <w:rFonts w:ascii="Times New Roman" w:hAnsi="Times New Roman" w:cs="Times New Roman"/>
           <w:b/>
           <w:sz w:val="24"/>
         </w:rPr>
@@ -280,7 +280,7 @@
     <w:p>
       <w:pPr>
         <w:rPr>
-          <w:rFonts w:ascii="Times New Roman" w:hAnsi="Times New Roman" w:cs="Times New Roman" w:hint="eastAsia"/>
+          <w:rFonts w:ascii="Times New Roman" w:hAnsi="Times New Roman" w:cs="Times New Roman"/>
           <w:sz w:val="24"/>
         </w:rPr>
       </w:pPr>
@@ -493,25 +493,7 @@
           <w:sz w:val="24"/>
         </w:rPr>
         <w:lastRenderedPageBreak/>
-        <w:t xml:space="preserve">Integer </w:t>
-      </w:r>
-      <w:proofErr w:type="spellStart"/>
-      <w:r>
-        <w:rPr>
-          <w:rFonts w:ascii="Times New Roman" w:hAnsi="Times New Roman" w:cs="Times New Roman" w:hint="eastAsia"/>
-          <w:b/>
-          <w:sz w:val="24"/>
-        </w:rPr>
-        <w:t>Arithemetic</w:t>
-      </w:r>
-      <w:proofErr w:type="spellEnd"/>
-      <w:r>
-        <w:rPr>
-          <w:rFonts w:ascii="Times New Roman" w:hAnsi="Times New Roman" w:cs="Times New Roman" w:hint="eastAsia"/>
-          <w:b/>
-          <w:sz w:val="24"/>
-        </w:rPr>
-        <w:t xml:space="preserve"> Operation</w:t>
+        <w:t>Integer Arithmetic Operation</w:t>
       </w:r>
       <w:r>
         <w:rPr>
@@ -567,14 +549,30 @@
           <w:rFonts w:ascii="Times New Roman" w:hAnsi="Times New Roman" w:cs="Times New Roman" w:hint="eastAsia"/>
           <w:b/>
         </w:rPr>
-        <w:t>Conditional Codes</w:t>
-      </w:r>
-      <w:r>
-        <w:rPr>
-          <w:rFonts w:ascii="Times New Roman" w:hAnsi="Times New Roman" w:cs="Times New Roman" w:hint="eastAsia"/>
-          <w:b/>
-        </w:rPr>
-        <w:t xml:space="preserve">  (Page 219)</w:t>
+        <w:t xml:space="preserve">Conditional </w:t>
+      </w:r>
+      <w:proofErr w:type="gramStart"/>
+      <w:r>
+        <w:rPr>
+          <w:rFonts w:ascii="Times New Roman" w:hAnsi="Times New Roman" w:cs="Times New Roman" w:hint="eastAsia"/>
+          <w:b/>
+        </w:rPr>
+        <w:t>Codes</w:t>
+      </w:r>
+      <w:r>
+        <w:rPr>
+          <w:rFonts w:ascii="Times New Roman" w:hAnsi="Times New Roman" w:cs="Times New Roman" w:hint="eastAsia"/>
+          <w:b/>
+        </w:rPr>
+        <w:t xml:space="preserve">  (</w:t>
+      </w:r>
+      <w:proofErr w:type="gramEnd"/>
+      <w:r>
+        <w:rPr>
+          <w:rFonts w:ascii="Times New Roman" w:hAnsi="Times New Roman" w:cs="Times New Roman" w:hint="eastAsia"/>
+          <w:b/>
+        </w:rPr>
+        <w:t>Page 219)</w:t>
       </w:r>
     </w:p>
     <w:p>
@@ -841,16 +839,23 @@
       <w:pPr>
         <w:outlineLvl w:val="1"/>
         <w:rPr>
-          <w:rFonts w:ascii="Times New Roman" w:hAnsi="Times New Roman" w:cs="Times New Roman"/>
-          <w:b/>
-        </w:rPr>
-      </w:pPr>
-      <w:r>
-        <w:rPr>
-          <w:rFonts w:ascii="Times New Roman" w:hAnsi="Times New Roman" w:cs="Times New Roman" w:hint="eastAsia"/>
-          <w:b/>
-        </w:rPr>
-        <w:t>Y86 Instruction Set Page 372</w:t>
+          <w:rFonts w:ascii="Times New Roman" w:hAnsi="Times New Roman" w:cs="Times New Roman" w:hint="eastAsia"/>
+          <w:b/>
+        </w:rPr>
+      </w:pPr>
+      <w:r>
+        <w:rPr>
+          <w:rFonts w:ascii="Times New Roman" w:hAnsi="Times New Roman" w:cs="Times New Roman" w:hint="eastAsia"/>
+          <w:b/>
+        </w:rPr>
+        <w:t>Conditional Move</w:t>
+      </w:r>
+      <w:r>
+        <w:rPr>
+          <w:rFonts w:ascii="Times New Roman" w:hAnsi="Times New Roman" w:cs="Times New Roman" w:hint="eastAsia"/>
+          <w:b/>
+        </w:rPr>
+        <w:t xml:space="preserve"> Instructions</w:t>
       </w:r>
     </w:p>
     <w:p>
@@ -859,10 +864,10 @@
           <w:noProof/>
         </w:rPr>
         <w:drawing>
-          <wp:inline distT="0" distB="0" distL="0" distR="0" wp14:anchorId="77A08C79" wp14:editId="65736786">
-            <wp:extent cx="5274310" cy="1990075"/>
-            <wp:effectExtent l="0" t="0" r="2540" b="0"/>
-            <wp:docPr id="11" name="图片 11"/>
+          <wp:inline distT="0" distB="0" distL="0" distR="0" wp14:anchorId="42AC5C52" wp14:editId="2AFFFB96">
+            <wp:extent cx="5274310" cy="3479800"/>
+            <wp:effectExtent l="0" t="0" r="2540" b="6350"/>
+            <wp:docPr id="967032761" name="Picture 1"/>
             <wp:cNvGraphicFramePr>
               <a:graphicFrameLocks xmlns:a="http://schemas.openxmlformats.org/drawingml/2006/main" noChangeAspect="1"/>
             </wp:cNvGraphicFramePr>
@@ -870,7 +875,7 @@
               <a:graphicData uri="http://schemas.openxmlformats.org/drawingml/2006/picture">
                 <pic:pic xmlns:pic="http://schemas.openxmlformats.org/drawingml/2006/picture">
                   <pic:nvPicPr>
-                    <pic:cNvPr id="0" name=""/>
+                    <pic:cNvPr id="967032761" name=""/>
                     <pic:cNvPicPr/>
                   </pic:nvPicPr>
                   <pic:blipFill>
@@ -882,7 +887,7 @@
                   <pic:spPr>
                     <a:xfrm>
                       <a:off x="0" y="0"/>
-                      <a:ext cx="5274310" cy="1990075"/>
+                      <a:ext cx="5274310" cy="3479800"/>
                     </a:xfrm>
                     <a:prstGeom prst="rect">
                       <a:avLst/>
@@ -895,17 +900,42 @@
         </w:drawing>
       </w:r>
     </w:p>
+    <w:p/>
+    <w:p/>
+    <w:p>
+      <w:pPr>
+        <w:rPr>
+          <w:rFonts w:hint="eastAsia"/>
+        </w:rPr>
+      </w:pPr>
+    </w:p>
+    <w:p>
+      <w:pPr>
+        <w:outlineLvl w:val="1"/>
+        <w:rPr>
+          <w:rFonts w:ascii="Times New Roman" w:hAnsi="Times New Roman" w:cs="Times New Roman"/>
+          <w:b/>
+        </w:rPr>
+      </w:pPr>
+      <w:r>
+        <w:rPr>
+          <w:rFonts w:ascii="Times New Roman" w:hAnsi="Times New Roman" w:cs="Times New Roman" w:hint="eastAsia"/>
+          <w:b/>
+        </w:rPr>
+        <w:lastRenderedPageBreak/>
+        <w:t>Y86 Instruction Set Page 372</w:t>
+      </w:r>
+    </w:p>
     <w:p>
       <w:r>
         <w:rPr>
           <w:noProof/>
         </w:rPr>
-        <w:lastRenderedPageBreak/>
         <w:drawing>
-          <wp:inline distT="0" distB="0" distL="0" distR="0" wp14:anchorId="4624F87E" wp14:editId="77CC2441">
-            <wp:extent cx="5274310" cy="3636466"/>
-            <wp:effectExtent l="0" t="0" r="2540" b="2540"/>
-            <wp:docPr id="8" name="图片 8"/>
+          <wp:inline distT="0" distB="0" distL="0" distR="0" wp14:anchorId="77A08C79" wp14:editId="65736786">
+            <wp:extent cx="5274310" cy="1990075"/>
+            <wp:effectExtent l="0" t="0" r="2540" b="0"/>
+            <wp:docPr id="11" name="图片 11"/>
             <wp:cNvGraphicFramePr>
               <a:graphicFrameLocks xmlns:a="http://schemas.openxmlformats.org/drawingml/2006/main" noChangeAspect="1"/>
             </wp:cNvGraphicFramePr>
@@ -925,7 +955,7 @@
                   <pic:spPr>
                     <a:xfrm>
                       <a:off x="0" y="0"/>
-                      <a:ext cx="5274310" cy="3636466"/>
+                      <a:ext cx="5274310" cy="1990075"/>
                     </a:xfrm>
                     <a:prstGeom prst="rect">
                       <a:avLst/>
@@ -944,10 +974,10 @@
           <w:noProof/>
         </w:rPr>
         <w:drawing>
-          <wp:inline distT="0" distB="0" distL="0" distR="0" wp14:anchorId="6B6CCE07" wp14:editId="5A17264C">
-            <wp:extent cx="5274310" cy="2264779"/>
+          <wp:inline distT="0" distB="0" distL="0" distR="0" wp14:anchorId="4624F87E" wp14:editId="77CC2441">
+            <wp:extent cx="5274310" cy="3636466"/>
             <wp:effectExtent l="0" t="0" r="2540" b="2540"/>
-            <wp:docPr id="9" name="图片 9"/>
+            <wp:docPr id="8" name="图片 8"/>
             <wp:cNvGraphicFramePr>
               <a:graphicFrameLocks xmlns:a="http://schemas.openxmlformats.org/drawingml/2006/main" noChangeAspect="1"/>
             </wp:cNvGraphicFramePr>
@@ -967,7 +997,7 @@
                   <pic:spPr>
                     <a:xfrm>
                       <a:off x="0" y="0"/>
-                      <a:ext cx="5274310" cy="2264779"/>
+                      <a:ext cx="5274310" cy="3636466"/>
                     </a:xfrm>
                     <a:prstGeom prst="rect">
                       <a:avLst/>
@@ -981,180 +1011,15 @@
       </w:r>
     </w:p>
     <w:p>
-      <w:pPr>
-        <w:rPr>
-          <w:b/>
-        </w:rPr>
-      </w:pPr>
-      <w:r>
-        <w:rPr>
-          <w:rFonts w:hint="eastAsia"/>
-          <w:b/>
-        </w:rPr>
-        <w:t xml:space="preserve">Note that in </w:t>
-      </w:r>
-      <w:r>
-        <w:rPr>
-          <w:rFonts w:hint="eastAsia"/>
-          <w:b/>
-        </w:rPr>
-        <w:t xml:space="preserve">the above </w:t>
-      </w:r>
-      <w:r>
-        <w:rPr>
-          <w:rFonts w:hint="eastAsia"/>
-          <w:b/>
-        </w:rPr>
-        <w:t xml:space="preserve">conditional moves </w:t>
-      </w:r>
-      <w:r>
-        <w:rPr>
-          <w:b/>
-        </w:rPr>
-        <w:t>“</w:t>
-      </w:r>
-      <w:r>
-        <w:rPr>
-          <w:rFonts w:hint="eastAsia"/>
-          <w:b/>
-        </w:rPr>
-        <w:t>l</w:t>
-      </w:r>
-      <w:r>
-        <w:rPr>
-          <w:b/>
-        </w:rPr>
-        <w:t>”</w:t>
-      </w:r>
-      <w:r>
-        <w:rPr>
-          <w:rFonts w:hint="eastAsia"/>
-          <w:b/>
-        </w:rPr>
-        <w:t xml:space="preserve"> doesn</w:t>
-      </w:r>
-      <w:r>
-        <w:rPr>
-          <w:b/>
-        </w:rPr>
-        <w:t>’</w:t>
-      </w:r>
-      <w:r>
-        <w:rPr>
-          <w:rFonts w:hint="eastAsia"/>
-          <w:b/>
-        </w:rPr>
-        <w:t xml:space="preserve">t represent </w:t>
-      </w:r>
-      <w:r>
-        <w:rPr>
-          <w:b/>
-        </w:rPr>
-        <w:t>“</w:t>
-      </w:r>
-      <w:r>
-        <w:rPr>
-          <w:rFonts w:hint="eastAsia"/>
-          <w:b/>
-        </w:rPr>
-        <w:t>double words</w:t>
-      </w:r>
-      <w:r>
-        <w:rPr>
-          <w:b/>
-        </w:rPr>
-        <w:t>”</w:t>
-      </w:r>
-      <w:r>
-        <w:rPr>
-          <w:rFonts w:hint="eastAsia"/>
-          <w:b/>
-        </w:rPr>
-        <w:t xml:space="preserve"> as in </w:t>
-      </w:r>
-      <w:r>
-        <w:rPr>
-          <w:b/>
-        </w:rPr>
-        <w:t>“</w:t>
-      </w:r>
-      <w:proofErr w:type="spellStart"/>
-      <w:r>
-        <w:rPr>
-          <w:rFonts w:hint="eastAsia"/>
-          <w:b/>
-        </w:rPr>
-        <w:t>movl</w:t>
-      </w:r>
-      <w:proofErr w:type="spellEnd"/>
-      <w:r>
-        <w:rPr>
-          <w:b/>
-        </w:rPr>
-        <w:t>”</w:t>
-      </w:r>
-      <w:r>
-        <w:rPr>
-          <w:rFonts w:hint="eastAsia"/>
-          <w:b/>
-        </w:rPr>
-        <w:t xml:space="preserve">, but represents </w:t>
-      </w:r>
-      <w:r>
-        <w:rPr>
-          <w:b/>
-        </w:rPr>
-        <w:t>“</w:t>
-      </w:r>
-      <w:r>
-        <w:rPr>
-          <w:rFonts w:hint="eastAsia"/>
-          <w:b/>
-        </w:rPr>
-        <w:t>less</w:t>
-      </w:r>
-      <w:r>
-        <w:rPr>
-          <w:b/>
-        </w:rPr>
-        <w:t>”</w:t>
-      </w:r>
-      <w:r>
-        <w:rPr>
-          <w:rFonts w:hint="eastAsia"/>
-          <w:b/>
-        </w:rPr>
-        <w:t>.</w:t>
-      </w:r>
-    </w:p>
-    <w:p>
-      <w:pPr>
-        <w:outlineLvl w:val="1"/>
-        <w:rPr>
-          <w:rFonts w:ascii="Times New Roman" w:hAnsi="Times New Roman" w:cs="Times New Roman"/>
-          <w:b/>
-        </w:rPr>
-      </w:pPr>
-      <w:r>
-        <w:rPr>
-          <w:rFonts w:ascii="Times New Roman" w:hAnsi="Times New Roman" w:cs="Times New Roman" w:hint="eastAsia"/>
-          <w:b/>
-        </w:rPr>
-        <w:t>Y86 Register Identifiers</w:t>
-      </w:r>
-    </w:p>
-    <w:p/>
-    <w:p>
       <w:r>
         <w:rPr>
           <w:noProof/>
         </w:rPr>
-        <w:lastRenderedPageBreak/>
         <w:drawing>
-          <wp:inline distT="0" distB="0" distL="0" distR="0" wp14:anchorId="7DE6058B" wp14:editId="61D899E9">
-            <wp:extent cx="5274310" cy="2711630"/>
-            <wp:effectExtent l="0" t="0" r="2540" b="0"/>
-            <wp:docPr id="10" name="图片 10"/>
+          <wp:inline distT="0" distB="0" distL="0" distR="0" wp14:anchorId="6B6CCE07" wp14:editId="5A17264C">
+            <wp:extent cx="5274310" cy="2264779"/>
+            <wp:effectExtent l="0" t="0" r="2540" b="2540"/>
+            <wp:docPr id="9" name="图片 9"/>
             <wp:cNvGraphicFramePr>
               <a:graphicFrameLocks xmlns:a="http://schemas.openxmlformats.org/drawingml/2006/main" noChangeAspect="1"/>
             </wp:cNvGraphicFramePr>
@@ -1174,7 +1039,7 @@
                   <pic:spPr>
                     <a:xfrm>
                       <a:off x="0" y="0"/>
-                      <a:ext cx="5274310" cy="2711630"/>
+                      <a:ext cx="5274310" cy="2264779"/>
                     </a:xfrm>
                     <a:prstGeom prst="rect">
                       <a:avLst/>
@@ -1189,34 +1054,195 @@
     </w:p>
     <w:p>
       <w:pPr>
+        <w:rPr>
+          <w:b/>
+        </w:rPr>
+      </w:pPr>
+      <w:r>
+        <w:rPr>
+          <w:rFonts w:hint="eastAsia"/>
+          <w:b/>
+        </w:rPr>
+        <w:lastRenderedPageBreak/>
+        <w:t xml:space="preserve">Note that in </w:t>
+      </w:r>
+      <w:r>
+        <w:rPr>
+          <w:rFonts w:hint="eastAsia"/>
+          <w:b/>
+        </w:rPr>
+        <w:t xml:space="preserve">the above </w:t>
+      </w:r>
+      <w:r>
+        <w:rPr>
+          <w:rFonts w:hint="eastAsia"/>
+          <w:b/>
+        </w:rPr>
+        <w:t xml:space="preserve">conditional </w:t>
+      </w:r>
+      <w:proofErr w:type="gramStart"/>
+      <w:r>
+        <w:rPr>
+          <w:rFonts w:hint="eastAsia"/>
+          <w:b/>
+        </w:rPr>
+        <w:t>moves</w:t>
+      </w:r>
+      <w:proofErr w:type="gramEnd"/>
+      <w:r>
+        <w:rPr>
+          <w:rFonts w:hint="eastAsia"/>
+          <w:b/>
+        </w:rPr>
+        <w:t xml:space="preserve"> </w:t>
+      </w:r>
+      <w:r>
+        <w:rPr>
+          <w:b/>
+        </w:rPr>
+        <w:t>“</w:t>
+      </w:r>
+      <w:r>
+        <w:rPr>
+          <w:rFonts w:hint="eastAsia"/>
+          <w:b/>
+        </w:rPr>
+        <w:t>l</w:t>
+      </w:r>
+      <w:r>
+        <w:rPr>
+          <w:b/>
+        </w:rPr>
+        <w:t>”</w:t>
+      </w:r>
+      <w:r>
+        <w:rPr>
+          <w:rFonts w:hint="eastAsia"/>
+          <w:b/>
+        </w:rPr>
+        <w:t xml:space="preserve"> doesn</w:t>
+      </w:r>
+      <w:r>
+        <w:rPr>
+          <w:b/>
+        </w:rPr>
+        <w:t>’</w:t>
+      </w:r>
+      <w:r>
+        <w:rPr>
+          <w:rFonts w:hint="eastAsia"/>
+          <w:b/>
+        </w:rPr>
+        <w:t xml:space="preserve">t represent </w:t>
+      </w:r>
+      <w:r>
+        <w:rPr>
+          <w:b/>
+        </w:rPr>
+        <w:t>“</w:t>
+      </w:r>
+      <w:r>
+        <w:rPr>
+          <w:rFonts w:hint="eastAsia"/>
+          <w:b/>
+        </w:rPr>
+        <w:t>double words</w:t>
+      </w:r>
+      <w:r>
+        <w:rPr>
+          <w:b/>
+        </w:rPr>
+        <w:t>”</w:t>
+      </w:r>
+      <w:r>
+        <w:rPr>
+          <w:rFonts w:hint="eastAsia"/>
+          <w:b/>
+        </w:rPr>
+        <w:t xml:space="preserve"> as in </w:t>
+      </w:r>
+      <w:r>
+        <w:rPr>
+          <w:b/>
+        </w:rPr>
+        <w:t>“</w:t>
+      </w:r>
+      <w:proofErr w:type="spellStart"/>
+      <w:r>
+        <w:rPr>
+          <w:rFonts w:hint="eastAsia"/>
+          <w:b/>
+        </w:rPr>
+        <w:t>movl</w:t>
+      </w:r>
+      <w:proofErr w:type="spellEnd"/>
+      <w:r>
+        <w:rPr>
+          <w:b/>
+        </w:rPr>
+        <w:t>”</w:t>
+      </w:r>
+      <w:r>
+        <w:rPr>
+          <w:rFonts w:hint="eastAsia"/>
+          <w:b/>
+        </w:rPr>
+        <w:t xml:space="preserve">, but represents </w:t>
+      </w:r>
+      <w:r>
+        <w:rPr>
+          <w:b/>
+        </w:rPr>
+        <w:t>“</w:t>
+      </w:r>
+      <w:r>
+        <w:rPr>
+          <w:rFonts w:hint="eastAsia"/>
+          <w:b/>
+        </w:rPr>
+        <w:t>less</w:t>
+      </w:r>
+      <w:r>
+        <w:rPr>
+          <w:b/>
+        </w:rPr>
+        <w:t>”</w:t>
+      </w:r>
+      <w:r>
+        <w:rPr>
+          <w:rFonts w:hint="eastAsia"/>
+          <w:b/>
+        </w:rPr>
+        <w:t>.</w:t>
+      </w:r>
+    </w:p>
+    <w:p>
+      <w:pPr>
         <w:outlineLvl w:val="1"/>
         <w:rPr>
           <w:rFonts w:ascii="Times New Roman" w:hAnsi="Times New Roman" w:cs="Times New Roman"/>
           <w:b/>
-          <w:sz w:val="24"/>
-          <w:szCs w:val="24"/>
-        </w:rPr>
-      </w:pPr>
-      <w:r>
-        <w:rPr>
-          <w:rFonts w:ascii="Times New Roman" w:hAnsi="Times New Roman" w:cs="Times New Roman" w:hint="eastAsia"/>
-          <w:b/>
-          <w:sz w:val="24"/>
-          <w:szCs w:val="24"/>
-        </w:rPr>
-        <w:t xml:space="preserve">Constant Values Used in HCL Descriptions </w:t>
-      </w:r>
-    </w:p>
+        </w:rPr>
+      </w:pPr>
+      <w:r>
+        <w:rPr>
+          <w:rFonts w:ascii="Times New Roman" w:hAnsi="Times New Roman" w:cs="Times New Roman" w:hint="eastAsia"/>
+          <w:b/>
+        </w:rPr>
+        <w:t>Y86 Register Identifiers</w:t>
+      </w:r>
+    </w:p>
+    <w:p/>
     <w:p>
       <w:r>
         <w:rPr>
           <w:noProof/>
         </w:rPr>
         <w:drawing>
-          <wp:inline distT="0" distB="0" distL="0" distR="0" wp14:anchorId="6C6B9ED1" wp14:editId="0320CB50">
-            <wp:extent cx="5274310" cy="5172364"/>
-            <wp:effectExtent l="0" t="0" r="2540" b="9525"/>
-            <wp:docPr id="15" name="图片 15"/>
+          <wp:inline distT="0" distB="0" distL="0" distR="0" wp14:anchorId="7DE6058B" wp14:editId="61D899E9">
+            <wp:extent cx="5274310" cy="2711630"/>
+            <wp:effectExtent l="0" t="0" r="2540" b="0"/>
+            <wp:docPr id="10" name="图片 10"/>
             <wp:cNvGraphicFramePr>
               <a:graphicFrameLocks xmlns:a="http://schemas.openxmlformats.org/drawingml/2006/main" noChangeAspect="1"/>
             </wp:cNvGraphicFramePr>
@@ -1236,6 +1262,69 @@
                   <pic:spPr>
                     <a:xfrm>
                       <a:off x="0" y="0"/>
+                      <a:ext cx="5274310" cy="2711630"/>
+                    </a:xfrm>
+                    <a:prstGeom prst="rect">
+                      <a:avLst/>
+                    </a:prstGeom>
+                  </pic:spPr>
+                </pic:pic>
+              </a:graphicData>
+            </a:graphic>
+          </wp:inline>
+        </w:drawing>
+      </w:r>
+    </w:p>
+    <w:p>
+      <w:pPr>
+        <w:outlineLvl w:val="1"/>
+        <w:rPr>
+          <w:rFonts w:ascii="Times New Roman" w:hAnsi="Times New Roman" w:cs="Times New Roman"/>
+          <w:b/>
+          <w:sz w:val="24"/>
+          <w:szCs w:val="24"/>
+        </w:rPr>
+      </w:pPr>
+      <w:r>
+        <w:rPr>
+          <w:rFonts w:ascii="Times New Roman" w:hAnsi="Times New Roman" w:cs="Times New Roman" w:hint="eastAsia"/>
+          <w:b/>
+          <w:sz w:val="24"/>
+          <w:szCs w:val="24"/>
+        </w:rPr>
+        <w:t xml:space="preserve">Constant Values Used in HCL Descriptions </w:t>
+      </w:r>
+    </w:p>
+    <w:p>
+      <w:r>
+        <w:rPr>
+          <w:noProof/>
+        </w:rPr>
+        <w:lastRenderedPageBreak/>
+        <w:drawing>
+          <wp:inline distT="0" distB="0" distL="0" distR="0" wp14:anchorId="6C6B9ED1" wp14:editId="0320CB50">
+            <wp:extent cx="5274310" cy="5172364"/>
+            <wp:effectExtent l="0" t="0" r="2540" b="9525"/>
+            <wp:docPr id="15" name="图片 15"/>
+            <wp:cNvGraphicFramePr>
+              <a:graphicFrameLocks xmlns:a="http://schemas.openxmlformats.org/drawingml/2006/main" noChangeAspect="1"/>
+            </wp:cNvGraphicFramePr>
+            <a:graphic xmlns:a="http://schemas.openxmlformats.org/drawingml/2006/main">
+              <a:graphicData uri="http://schemas.openxmlformats.org/drawingml/2006/picture">
+                <pic:pic xmlns:pic="http://schemas.openxmlformats.org/drawingml/2006/picture">
+                  <pic:nvPicPr>
+                    <pic:cNvPr id="0" name=""/>
+                    <pic:cNvPicPr/>
+                  </pic:nvPicPr>
+                  <pic:blipFill>
+                    <a:blip r:embed="rId20"/>
+                    <a:stretch>
+                      <a:fillRect/>
+                    </a:stretch>
+                  </pic:blipFill>
+                  <pic:spPr>
+                    <a:xfrm>
+                      <a:off x="0" y="0"/>
                       <a:ext cx="5274310" cy="5172364"/>
                     </a:xfrm>
                     <a:prstGeom prst="rect">
@@ -1267,15 +1356,15 @@
           <w:sz w:val="24"/>
           <w:szCs w:val="24"/>
         </w:rPr>
+        <w:t>Computational in Sequential Implementation of Y86</w:t>
+      </w:r>
+    </w:p>
+    <w:p>
+      <w:r>
+        <w:rPr>
+          <w:noProof/>
+        </w:rPr>
         <w:lastRenderedPageBreak/>
-        <w:t>Computational in Sequential Implementation of Y86</w:t>
-      </w:r>
-    </w:p>
-    <w:p>
-      <w:r>
-        <w:rPr>
-          <w:noProof/>
-        </w:rPr>
         <w:drawing>
           <wp:inline distT="0" distB="0" distL="0" distR="0" wp14:anchorId="7D70B96B" wp14:editId="799A85CD">
             <wp:extent cx="5274310" cy="4109720"/>
@@ -1292,7 +1381,7 @@
                     <pic:cNvPicPr/>
                   </pic:nvPicPr>
                   <pic:blipFill>
-                    <a:blip r:embed="rId20"/>
+                    <a:blip r:embed="rId21"/>
                     <a:stretch>
                       <a:fillRect/>
                     </a:stretch>
@@ -1334,7 +1423,7 @@
                     <pic:cNvPicPr/>
                   </pic:nvPicPr>
                   <pic:blipFill>
-                    <a:blip r:embed="rId21"/>
+                    <a:blip r:embed="rId22"/>
                     <a:stretch>
                       <a:fillRect/>
                     </a:stretch>
@@ -1377,7 +1466,7 @@
                     <pic:cNvPicPr/>
                   </pic:nvPicPr>
                   <pic:blipFill>
-                    <a:blip r:embed="rId22"/>
+                    <a:blip r:embed="rId23"/>
                     <a:stretch>
                       <a:fillRect/>
                     </a:stretch>

</xml_diff>

<commit_message>
update notes of 4.5.9 Exception Handling
</commit_message>
<xml_diff>
--- a/CSAPP/Tutorials/Screenshots of Figures of CSAPP2e.docx
+++ b/CSAPP/Tutorials/Screenshots of Figures of CSAPP2e.docx
@@ -839,7 +839,7 @@
       <w:pPr>
         <w:outlineLvl w:val="1"/>
         <w:rPr>
-          <w:rFonts w:ascii="Times New Roman" w:hAnsi="Times New Roman" w:cs="Times New Roman" w:hint="eastAsia"/>
+          <w:rFonts w:ascii="Times New Roman" w:hAnsi="Times New Roman" w:cs="Times New Roman"/>
           <w:b/>
         </w:rPr>
       </w:pPr>
@@ -902,13 +902,7 @@
     </w:p>
     <w:p/>
     <w:p/>
-    <w:p>
-      <w:pPr>
-        <w:rPr>
-          <w:rFonts w:hint="eastAsia"/>
-        </w:rPr>
-      </w:pPr>
-    </w:p>
+    <w:p/>
     <w:p>
       <w:pPr>
         <w:outlineLvl w:val="1"/>
@@ -1475,6 +1469,74 @@
                     <a:xfrm>
                       <a:off x="0" y="0"/>
                       <a:ext cx="5274310" cy="3622675"/>
+                    </a:xfrm>
+                    <a:prstGeom prst="rect">
+                      <a:avLst/>
+                    </a:prstGeom>
+                  </pic:spPr>
+                </pic:pic>
+              </a:graphicData>
+            </a:graphic>
+          </wp:inline>
+        </w:drawing>
+      </w:r>
+    </w:p>
+    <w:p>
+      <w:pPr>
+        <w:outlineLvl w:val="1"/>
+        <w:rPr>
+          <w:rFonts w:ascii="Times New Roman" w:hAnsi="Times New Roman" w:cs="Times New Roman"/>
+          <w:b/>
+          <w:sz w:val="24"/>
+          <w:szCs w:val="24"/>
+        </w:rPr>
+      </w:pPr>
+      <w:r>
+        <w:rPr>
+          <w:rFonts w:ascii="Times New Roman" w:hAnsi="Times New Roman" w:cs="Times New Roman" w:hint="eastAsia"/>
+          <w:b/>
+          <w:sz w:val="24"/>
+          <w:szCs w:val="24"/>
+        </w:rPr>
+        <w:t>Hardware Structure of SEQ</w:t>
+      </w:r>
+    </w:p>
+    <w:p>
+      <w:pPr>
+        <w:rPr>
+          <w:rFonts w:hint="eastAsia"/>
+        </w:rPr>
+      </w:pPr>
+      <w:r>
+        <w:rPr>
+          <w:noProof/>
+        </w:rPr>
+        <w:lastRenderedPageBreak/>
+        <w:drawing>
+          <wp:inline distT="0" distB="0" distL="0" distR="0" wp14:anchorId="1E8FE364" wp14:editId="4267F33D">
+            <wp:extent cx="5274310" cy="6019800"/>
+            <wp:effectExtent l="0" t="0" r="2540" b="0"/>
+            <wp:docPr id="274712680" name="Picture 1"/>
+            <wp:cNvGraphicFramePr>
+              <a:graphicFrameLocks xmlns:a="http://schemas.openxmlformats.org/drawingml/2006/main" noChangeAspect="1"/>
+            </wp:cNvGraphicFramePr>
+            <a:graphic xmlns:a="http://schemas.openxmlformats.org/drawingml/2006/main">
+              <a:graphicData uri="http://schemas.openxmlformats.org/drawingml/2006/picture">
+                <pic:pic xmlns:pic="http://schemas.openxmlformats.org/drawingml/2006/picture">
+                  <pic:nvPicPr>
+                    <pic:cNvPr id="274712680" name=""/>
+                    <pic:cNvPicPr/>
+                  </pic:nvPicPr>
+                  <pic:blipFill>
+                    <a:blip r:embed="rId24"/>
+                    <a:stretch>
+                      <a:fillRect/>
+                    </a:stretch>
+                  </pic:blipFill>
+                  <pic:spPr>
+                    <a:xfrm>
+                      <a:off x="0" y="0"/>
+                      <a:ext cx="5274310" cy="6019800"/>
                     </a:xfrm>
                     <a:prstGeom prst="rect">
                       <a:avLst/>

</xml_diff>

<commit_message>
forwarding d_valA in decode stage
</commit_message>
<xml_diff>
--- a/CSAPP/Tutorials/Screenshots of Figures of CSAPP2e.docx
+++ b/CSAPP/Tutorials/Screenshots of Figures of CSAPP2e.docx
@@ -427,34 +427,18 @@
           <w:tab w:val="center" w:pos="4153"/>
         </w:tabs>
       </w:pPr>
-      <w:proofErr w:type="spellStart"/>
       <w:r>
         <w:rPr>
           <w:rFonts w:hint="eastAsia"/>
         </w:rPr>
-        <w:t>movabs</w:t>
-      </w:r>
-      <w:proofErr w:type="spellEnd"/>
+        <w:t>movabs $0x400921fb4d12d84a, $ea</w:t>
+      </w:r>
       <w:r>
         <w:rPr>
           <w:rFonts w:hint="eastAsia"/>
         </w:rPr>
-        <w:t xml:space="preserve"> $0x400921fb4d12d84a, $</w:t>
-      </w:r>
-      <w:proofErr w:type="spellStart"/>
-      <w:r>
-        <w:rPr>
-          <w:rFonts w:hint="eastAsia"/>
-        </w:rPr>
-        <w:t>ea</w:t>
-      </w:r>
-      <w:r>
-        <w:rPr>
-          <w:rFonts w:hint="eastAsia"/>
-        </w:rPr>
         <w:t>x</w:t>
       </w:r>
-      <w:proofErr w:type="spellEnd"/>
     </w:p>
     <w:p>
       <w:pPr>
@@ -462,19 +446,11 @@
           <w:tab w:val="center" w:pos="4153"/>
         </w:tabs>
       </w:pPr>
-      <w:proofErr w:type="spellStart"/>
       <w:r>
         <w:rPr>
           <w:rFonts w:hint="eastAsia"/>
         </w:rPr>
-        <w:t>movabs</w:t>
-      </w:r>
-      <w:proofErr w:type="spellEnd"/>
-      <w:r>
-        <w:rPr>
-          <w:rFonts w:hint="eastAsia"/>
-        </w:rPr>
-        <w:t xml:space="preserve">: move a full 64-bit value or a 64-bit absolute memory address. </w:t>
+        <w:t xml:space="preserve">movabs: move a full 64-bit value or a 64-bit absolute memory address. </w:t>
       </w:r>
     </w:p>
     <w:p>
@@ -549,30 +525,14 @@
           <w:rFonts w:ascii="Times New Roman" w:hAnsi="Times New Roman" w:cs="Times New Roman" w:hint="eastAsia"/>
           <w:b/>
         </w:rPr>
-        <w:t xml:space="preserve">Conditional </w:t>
-      </w:r>
-      <w:proofErr w:type="gramStart"/>
+        <w:t>Conditional Codes</w:t>
+      </w:r>
       <w:r>
         <w:rPr>
           <w:rFonts w:ascii="Times New Roman" w:hAnsi="Times New Roman" w:cs="Times New Roman" w:hint="eastAsia"/>
           <w:b/>
         </w:rPr>
-        <w:t>Codes</w:t>
-      </w:r>
-      <w:r>
-        <w:rPr>
-          <w:rFonts w:ascii="Times New Roman" w:hAnsi="Times New Roman" w:cs="Times New Roman" w:hint="eastAsia"/>
-          <w:b/>
-        </w:rPr>
-        <w:t xml:space="preserve">  (</w:t>
-      </w:r>
-      <w:proofErr w:type="gramEnd"/>
-      <w:r>
-        <w:rPr>
-          <w:rFonts w:ascii="Times New Roman" w:hAnsi="Times New Roman" w:cs="Times New Roman" w:hint="eastAsia"/>
-          <w:b/>
-        </w:rPr>
-        <w:t>Page 219)</w:t>
+        <w:t xml:space="preserve">  (Page 219)</w:t>
       </w:r>
     </w:p>
     <w:p>
@@ -1072,23 +1032,46 @@
           <w:rFonts w:hint="eastAsia"/>
           <w:b/>
         </w:rPr>
-        <w:t xml:space="preserve">conditional </w:t>
-      </w:r>
-      <w:proofErr w:type="gramStart"/>
+        <w:t xml:space="preserve">conditional moves </w:t>
+      </w:r>
+      <w:r>
+        <w:rPr>
+          <w:b/>
+        </w:rPr>
+        <w:t>“</w:t>
+      </w:r>
       <w:r>
         <w:rPr>
           <w:rFonts w:hint="eastAsia"/>
           <w:b/>
         </w:rPr>
-        <w:t>moves</w:t>
-      </w:r>
-      <w:proofErr w:type="gramEnd"/>
+        <w:t>l</w:t>
+      </w:r>
+      <w:r>
+        <w:rPr>
+          <w:b/>
+        </w:rPr>
+        <w:t>”</w:t>
+      </w:r>
       <w:r>
         <w:rPr>
           <w:rFonts w:hint="eastAsia"/>
           <w:b/>
         </w:rPr>
-        <w:t xml:space="preserve"> </w:t>
+        <w:t xml:space="preserve"> doesn</w:t>
+      </w:r>
+      <w:r>
+        <w:rPr>
+          <w:b/>
+        </w:rPr>
+        <w:t>’</w:t>
+      </w:r>
+      <w:r>
+        <w:rPr>
+          <w:rFonts w:hint="eastAsia"/>
+          <w:b/>
+        </w:rPr>
+        <w:t xml:space="preserve">t represent </w:t>
       </w:r>
       <w:r>
         <w:rPr>
@@ -1101,7 +1084,7 @@
           <w:rFonts w:hint="eastAsia"/>
           <w:b/>
         </w:rPr>
-        <w:t>l</w:t>
+        <w:t>double words</w:t>
       </w:r>
       <w:r>
         <w:rPr>
@@ -1114,62 +1097,21 @@
           <w:rFonts w:hint="eastAsia"/>
           <w:b/>
         </w:rPr>
-        <w:t xml:space="preserve"> doesn</w:t>
-      </w:r>
-      <w:r>
-        <w:rPr>
-          <w:b/>
-        </w:rPr>
-        <w:t>’</w:t>
+        <w:t xml:space="preserve"> as in </w:t>
+      </w:r>
+      <w:r>
+        <w:rPr>
+          <w:b/>
+        </w:rPr>
+        <w:t>“</w:t>
       </w:r>
       <w:r>
         <w:rPr>
           <w:rFonts w:hint="eastAsia"/>
           <w:b/>
         </w:rPr>
-        <w:t xml:space="preserve">t represent </w:t>
-      </w:r>
-      <w:r>
-        <w:rPr>
-          <w:b/>
-        </w:rPr>
-        <w:t>“</w:t>
-      </w:r>
-      <w:r>
-        <w:rPr>
-          <w:rFonts w:hint="eastAsia"/>
-          <w:b/>
-        </w:rPr>
-        <w:t>double words</w:t>
-      </w:r>
-      <w:r>
-        <w:rPr>
-          <w:b/>
-        </w:rPr>
-        <w:t>”</w:t>
-      </w:r>
-      <w:r>
-        <w:rPr>
-          <w:rFonts w:hint="eastAsia"/>
-          <w:b/>
-        </w:rPr>
-        <w:t xml:space="preserve"> as in </w:t>
-      </w:r>
-      <w:r>
-        <w:rPr>
-          <w:b/>
-        </w:rPr>
-        <w:t>“</w:t>
-      </w:r>
-      <w:proofErr w:type="spellStart"/>
-      <w:r>
-        <w:rPr>
-          <w:rFonts w:hint="eastAsia"/>
-          <w:b/>
-        </w:rPr>
         <w:t>movl</w:t>
       </w:r>
-      <w:proofErr w:type="spellEnd"/>
       <w:r>
         <w:rPr>
           <w:b/>
@@ -1482,6 +1424,91 @@
       </w:r>
     </w:p>
     <w:p>
+      <w:r>
+        <w:rPr>
+          <w:noProof/>
+        </w:rPr>
+        <w:drawing>
+          <wp:inline distT="0" distB="0" distL="0" distR="0" wp14:anchorId="5E378C3E" wp14:editId="39069B1E">
+            <wp:extent cx="5274310" cy="3597910"/>
+            <wp:effectExtent l="0" t="0" r="2540" b="2540"/>
+            <wp:docPr id="1902241994" name="Picture 1"/>
+            <wp:cNvGraphicFramePr>
+              <a:graphicFrameLocks xmlns:a="http://schemas.openxmlformats.org/drawingml/2006/main" noChangeAspect="1"/>
+            </wp:cNvGraphicFramePr>
+            <a:graphic xmlns:a="http://schemas.openxmlformats.org/drawingml/2006/main">
+              <a:graphicData uri="http://schemas.openxmlformats.org/drawingml/2006/picture">
+                <pic:pic xmlns:pic="http://schemas.openxmlformats.org/drawingml/2006/picture">
+                  <pic:nvPicPr>
+                    <pic:cNvPr id="1902241994" name=""/>
+                    <pic:cNvPicPr/>
+                  </pic:nvPicPr>
+                  <pic:blipFill>
+                    <a:blip r:embed="rId24"/>
+                    <a:stretch>
+                      <a:fillRect/>
+                    </a:stretch>
+                  </pic:blipFill>
+                  <pic:spPr>
+                    <a:xfrm>
+                      <a:off x="0" y="0"/>
+                      <a:ext cx="5274310" cy="3597910"/>
+                    </a:xfrm>
+                    <a:prstGeom prst="rect">
+                      <a:avLst/>
+                    </a:prstGeom>
+                  </pic:spPr>
+                </pic:pic>
+              </a:graphicData>
+            </a:graphic>
+          </wp:inline>
+        </w:drawing>
+      </w:r>
+    </w:p>
+    <w:p>
+      <w:r>
+        <w:rPr>
+          <w:noProof/>
+        </w:rPr>
+        <w:lastRenderedPageBreak/>
+        <w:drawing>
+          <wp:inline distT="0" distB="0" distL="0" distR="0" wp14:anchorId="3B7F240F" wp14:editId="33D6A10A">
+            <wp:extent cx="5274310" cy="3396615"/>
+            <wp:effectExtent l="0" t="0" r="2540" b="0"/>
+            <wp:docPr id="2040196445" name="Picture 1"/>
+            <wp:cNvGraphicFramePr>
+              <a:graphicFrameLocks xmlns:a="http://schemas.openxmlformats.org/drawingml/2006/main" noChangeAspect="1"/>
+            </wp:cNvGraphicFramePr>
+            <a:graphic xmlns:a="http://schemas.openxmlformats.org/drawingml/2006/main">
+              <a:graphicData uri="http://schemas.openxmlformats.org/drawingml/2006/picture">
+                <pic:pic xmlns:pic="http://schemas.openxmlformats.org/drawingml/2006/picture">
+                  <pic:nvPicPr>
+                    <pic:cNvPr id="2040196445" name=""/>
+                    <pic:cNvPicPr/>
+                  </pic:nvPicPr>
+                  <pic:blipFill>
+                    <a:blip r:embed="rId25"/>
+                    <a:stretch>
+                      <a:fillRect/>
+                    </a:stretch>
+                  </pic:blipFill>
+                  <pic:spPr>
+                    <a:xfrm>
+                      <a:off x="0" y="0"/>
+                      <a:ext cx="5274310" cy="3396615"/>
+                    </a:xfrm>
+                    <a:prstGeom prst="rect">
+                      <a:avLst/>
+                    </a:prstGeom>
+                  </pic:spPr>
+                </pic:pic>
+              </a:graphicData>
+            </a:graphic>
+          </wp:inline>
+        </w:drawing>
+      </w:r>
+    </w:p>
+    <w:p>
       <w:pPr>
         <w:outlineLvl w:val="1"/>
         <w:rPr>
@@ -1502,11 +1529,6 @@
       </w:r>
     </w:p>
     <w:p>
-      <w:pPr>
-        <w:rPr>
-          <w:rFonts w:hint="eastAsia"/>
-        </w:rPr>
-      </w:pPr>
       <w:r>
         <w:rPr>
           <w:noProof/>
@@ -1528,7 +1550,7 @@
                     <pic:cNvPicPr/>
                   </pic:nvPicPr>
                   <pic:blipFill>
-                    <a:blip r:embed="rId24"/>
+                    <a:blip r:embed="rId26"/>
                     <a:stretch>
                       <a:fillRect/>
                     </a:stretch>

</xml_diff>

<commit_message>
add answer of problem 4.33
</commit_message>
<xml_diff>
--- a/CSAPP/Tutorials/Screenshots of Figures of CSAPP2e.docx
+++ b/CSAPP/Tutorials/Screenshots of Figures of CSAPP2e.docx
@@ -427,18 +427,34 @@
           <w:tab w:val="center" w:pos="4153"/>
         </w:tabs>
       </w:pPr>
+      <w:proofErr w:type="spellStart"/>
       <w:r>
         <w:rPr>
           <w:rFonts w:hint="eastAsia"/>
         </w:rPr>
-        <w:t>movabs $0x400921fb4d12d84a, $ea</w:t>
-      </w:r>
+        <w:t>movabs</w:t>
+      </w:r>
+      <w:proofErr w:type="spellEnd"/>
       <w:r>
         <w:rPr>
           <w:rFonts w:hint="eastAsia"/>
         </w:rPr>
+        <w:t xml:space="preserve"> $0x400921fb4d12d84a, $</w:t>
+      </w:r>
+      <w:proofErr w:type="spellStart"/>
+      <w:r>
+        <w:rPr>
+          <w:rFonts w:hint="eastAsia"/>
+        </w:rPr>
+        <w:t>ea</w:t>
+      </w:r>
+      <w:r>
+        <w:rPr>
+          <w:rFonts w:hint="eastAsia"/>
+        </w:rPr>
         <w:t>x</w:t>
       </w:r>
+      <w:proofErr w:type="spellEnd"/>
     </w:p>
     <w:p>
       <w:pPr>
@@ -446,11 +462,19 @@
           <w:tab w:val="center" w:pos="4153"/>
         </w:tabs>
       </w:pPr>
+      <w:proofErr w:type="spellStart"/>
       <w:r>
         <w:rPr>
           <w:rFonts w:hint="eastAsia"/>
         </w:rPr>
-        <w:t xml:space="preserve">movabs: move a full 64-bit value or a 64-bit absolute memory address. </w:t>
+        <w:t>movabs</w:t>
+      </w:r>
+      <w:proofErr w:type="spellEnd"/>
+      <w:r>
+        <w:rPr>
+          <w:rFonts w:hint="eastAsia"/>
+        </w:rPr>
+        <w:t xml:space="preserve">: move a full 64-bit value or a 64-bit absolute memory address. </w:t>
       </w:r>
     </w:p>
     <w:p>
@@ -1105,6 +1129,7 @@
         </w:rPr>
         <w:t>“</w:t>
       </w:r>
+      <w:proofErr w:type="spellStart"/>
       <w:r>
         <w:rPr>
           <w:rFonts w:hint="eastAsia"/>
@@ -1112,6 +1137,7 @@
         </w:rPr>
         <w:t>movl</w:t>
       </w:r>
+      <w:proofErr w:type="spellEnd"/>
       <w:r>
         <w:rPr>
           <w:b/>
@@ -1510,6 +1536,102 @@
     </w:p>
     <w:p>
       <w:pPr>
+        <w:rPr>
+          <w:rFonts w:hint="eastAsia"/>
+          <w:b/>
+          <w:bCs/>
+        </w:rPr>
+      </w:pPr>
+      <w:r>
+        <w:rPr>
+          <w:rFonts w:hint="eastAsia"/>
+          <w:b/>
+          <w:bCs/>
+        </w:rPr>
+        <w:t>Conditional Moves</w:t>
+      </w:r>
+      <w:r>
+        <w:rPr>
+          <w:rFonts w:hint="eastAsia"/>
+          <w:b/>
+          <w:bCs/>
+        </w:rPr>
+        <w:t>(The is no figure for this instruction, it is a practice probl</w:t>
+      </w:r>
+      <w:r>
+        <w:rPr>
+          <w:rFonts w:hint="eastAsia"/>
+          <w:b/>
+          <w:bCs/>
+        </w:rPr>
+        <w:t>em</w:t>
+      </w:r>
+      <w:r>
+        <w:rPr>
+          <w:rFonts w:hint="eastAsia"/>
+          <w:b/>
+          <w:bCs/>
+        </w:rPr>
+        <w:t>)</w:t>
+      </w:r>
+      <w:r>
+        <w:rPr>
+          <w:rFonts w:hint="eastAsia"/>
+          <w:b/>
+          <w:bCs/>
+        </w:rPr>
+        <w:t>.</w:t>
+      </w:r>
+    </w:p>
+    <w:p>
+      <w:r>
+        <w:rPr>
+          <w:noProof/>
+        </w:rPr>
+        <w:drawing>
+          <wp:inline distT="0" distB="0" distL="0" distR="0" wp14:anchorId="79C13374" wp14:editId="62969EA1">
+            <wp:extent cx="5274310" cy="3365500"/>
+            <wp:effectExtent l="0" t="0" r="2540" b="6350"/>
+            <wp:docPr id="1791165608" name="Picture 1"/>
+            <wp:cNvGraphicFramePr>
+              <a:graphicFrameLocks xmlns:a="http://schemas.openxmlformats.org/drawingml/2006/main" noChangeAspect="1"/>
+            </wp:cNvGraphicFramePr>
+            <a:graphic xmlns:a="http://schemas.openxmlformats.org/drawingml/2006/main">
+              <a:graphicData uri="http://schemas.openxmlformats.org/drawingml/2006/picture">
+                <pic:pic xmlns:pic="http://schemas.openxmlformats.org/drawingml/2006/picture">
+                  <pic:nvPicPr>
+                    <pic:cNvPr id="1791165608" name=""/>
+                    <pic:cNvPicPr/>
+                  </pic:nvPicPr>
+                  <pic:blipFill>
+                    <a:blip r:embed="rId26"/>
+                    <a:stretch>
+                      <a:fillRect/>
+                    </a:stretch>
+                  </pic:blipFill>
+                  <pic:spPr>
+                    <a:xfrm>
+                      <a:off x="0" y="0"/>
+                      <a:ext cx="5274310" cy="3365500"/>
+                    </a:xfrm>
+                    <a:prstGeom prst="rect">
+                      <a:avLst/>
+                    </a:prstGeom>
+                  </pic:spPr>
+                </pic:pic>
+              </a:graphicData>
+            </a:graphic>
+          </wp:inline>
+        </w:drawing>
+      </w:r>
+    </w:p>
+    <w:p/>
+    <w:p/>
+    <w:p/>
+    <w:p/>
+    <w:p/>
+    <w:p>
+      <w:pPr>
         <w:outlineLvl w:val="1"/>
         <w:rPr>
           <w:rFonts w:ascii="Times New Roman" w:hAnsi="Times New Roman" w:cs="Times New Roman"/>
@@ -1525,6 +1647,7 @@
           <w:sz w:val="24"/>
           <w:szCs w:val="24"/>
         </w:rPr>
+        <w:lastRenderedPageBreak/>
         <w:t>Hardware Structure of SEQ</w:t>
       </w:r>
     </w:p>
@@ -1533,7 +1656,6 @@
         <w:rPr>
           <w:noProof/>
         </w:rPr>
-        <w:lastRenderedPageBreak/>
         <w:drawing>
           <wp:inline distT="0" distB="0" distL="0" distR="0" wp14:anchorId="1E8FE364" wp14:editId="4267F33D">
             <wp:extent cx="5274310" cy="6019800"/>
@@ -1550,7 +1672,7 @@
                     <pic:cNvPicPr/>
                   </pic:nvPicPr>
                   <pic:blipFill>
-                    <a:blip r:embed="rId26"/>
+                    <a:blip r:embed="rId27"/>
                     <a:stretch>
                       <a:fillRect/>
                     </a:stretch>

</xml_diff>

<commit_message>
add explanation of Figure 4.66 Actions of pipeline logic
</commit_message>
<xml_diff>
--- a/CSAPP/Tutorials/Screenshots of Figures of CSAPP2e.docx
+++ b/CSAPP/Tutorials/Screenshots of Figures of CSAPP2e.docx
@@ -549,30 +549,14 @@
           <w:rFonts w:ascii="Times New Roman" w:hAnsi="Times New Roman" w:cs="Times New Roman" w:hint="eastAsia"/>
           <w:b/>
         </w:rPr>
-        <w:t xml:space="preserve">Conditional </w:t>
-      </w:r>
-      <w:proofErr w:type="gramStart"/>
+        <w:t>Conditional Codes</w:t>
+      </w:r>
       <w:r>
         <w:rPr>
           <w:rFonts w:ascii="Times New Roman" w:hAnsi="Times New Roman" w:cs="Times New Roman" w:hint="eastAsia"/>
           <w:b/>
         </w:rPr>
-        <w:t>Codes</w:t>
-      </w:r>
-      <w:r>
-        <w:rPr>
-          <w:rFonts w:ascii="Times New Roman" w:hAnsi="Times New Roman" w:cs="Times New Roman" w:hint="eastAsia"/>
-          <w:b/>
-        </w:rPr>
-        <w:t xml:space="preserve">  (</w:t>
-      </w:r>
-      <w:proofErr w:type="gramEnd"/>
-      <w:r>
-        <w:rPr>
-          <w:rFonts w:ascii="Times New Roman" w:hAnsi="Times New Roman" w:cs="Times New Roman" w:hint="eastAsia"/>
-          <w:b/>
-        </w:rPr>
-        <w:t>Page 219)</w:t>
+        <w:t xml:space="preserve">  (Page 219)</w:t>
       </w:r>
     </w:p>
     <w:p>
@@ -1072,23 +1056,7 @@
           <w:rFonts w:hint="eastAsia"/>
           <w:b/>
         </w:rPr>
-        <w:t xml:space="preserve">conditional </w:t>
-      </w:r>
-      <w:proofErr w:type="gramStart"/>
-      <w:r>
-        <w:rPr>
-          <w:rFonts w:hint="eastAsia"/>
-          <w:b/>
-        </w:rPr>
-        <w:t>moves</w:t>
-      </w:r>
-      <w:proofErr w:type="gramEnd"/>
-      <w:r>
-        <w:rPr>
-          <w:rFonts w:hint="eastAsia"/>
-          <w:b/>
-        </w:rPr>
-        <w:t xml:space="preserve"> </w:t>
+        <w:t xml:space="preserve">conditional moves </w:t>
       </w:r>
       <w:r>
         <w:rPr>
@@ -1279,6 +1247,15 @@
           <w:szCs w:val="24"/>
         </w:rPr>
       </w:pPr>
+      <w:r>
+        <w:rPr>
+          <w:rFonts w:ascii="Times New Roman" w:hAnsi="Times New Roman" w:cs="Times New Roman" w:hint="eastAsia"/>
+          <w:b/>
+          <w:sz w:val="24"/>
+          <w:szCs w:val="24"/>
+        </w:rPr>
+        <w:t xml:space="preserve">Figure 4.26 </w:t>
+      </w:r>
       <w:r>
         <w:rPr>
           <w:rFonts w:ascii="Times New Roman" w:hAnsi="Times New Roman" w:cs="Times New Roman" w:hint="eastAsia"/>
@@ -1579,33 +1556,15 @@
           <w:b/>
           <w:bCs/>
         </w:rPr>
-        <w:t xml:space="preserve">Conditional </w:t>
-      </w:r>
-      <w:proofErr w:type="gramStart"/>
+        <w:t>Conditional Moves</w:t>
+      </w:r>
       <w:r>
         <w:rPr>
           <w:rFonts w:hint="eastAsia"/>
           <w:b/>
           <w:bCs/>
         </w:rPr>
-        <w:t>Moves</w:t>
-      </w:r>
-      <w:r>
-        <w:rPr>
-          <w:rFonts w:hint="eastAsia"/>
-          <w:b/>
-          <w:bCs/>
-        </w:rPr>
-        <w:t>(</w:t>
-      </w:r>
-      <w:proofErr w:type="gramEnd"/>
-      <w:r>
-        <w:rPr>
-          <w:rFonts w:hint="eastAsia"/>
-          <w:b/>
-          <w:bCs/>
-        </w:rPr>
-        <w:t>The is no figure for this instruction, it is a practice probl</w:t>
+        <w:t>(The is no figure for this instruction, it is a practice probl</w:t>
       </w:r>
       <w:r>
         <w:rPr>
@@ -1809,7 +1768,7 @@
       <w:pPr>
         <w:outlineLvl w:val="1"/>
         <w:rPr>
-          <w:rFonts w:ascii="Times New Roman" w:hAnsi="Times New Roman" w:cs="Times New Roman" w:hint="eastAsia"/>
+          <w:rFonts w:ascii="Times New Roman" w:hAnsi="Times New Roman" w:cs="Times New Roman"/>
           <w:b/>
           <w:sz w:val="24"/>
           <w:szCs w:val="24"/>
@@ -1935,28 +1894,23 @@
       <w:pPr>
         <w:outlineLvl w:val="1"/>
         <w:rPr>
+          <w:rFonts w:ascii="Times New Roman" w:hAnsi="Times New Roman" w:cs="Times New Roman"/>
+          <w:b/>
+          <w:sz w:val="24"/>
+          <w:szCs w:val="24"/>
+        </w:rPr>
+      </w:pPr>
+      <w:r>
+        <w:rPr>
           <w:rFonts w:ascii="Times New Roman" w:hAnsi="Times New Roman" w:cs="Times New Roman" w:hint="eastAsia"/>
           <w:b/>
           <w:sz w:val="24"/>
           <w:szCs w:val="24"/>
         </w:rPr>
-      </w:pPr>
-      <w:r>
-        <w:rPr>
-          <w:rFonts w:ascii="Times New Roman" w:hAnsi="Times New Roman" w:cs="Times New Roman" w:hint="eastAsia"/>
-          <w:b/>
-          <w:sz w:val="24"/>
-          <w:szCs w:val="24"/>
-        </w:rPr>
         <w:t>Pipe</w:t>
       </w:r>
     </w:p>
     <w:p>
-      <w:pPr>
-        <w:rPr>
-          <w:rFonts w:hint="eastAsia"/>
-        </w:rPr>
-      </w:pPr>
       <w:r>
         <w:rPr>
           <w:noProof/>

</xml_diff>

<commit_message>
answers of problem 4.37 and 4.38
</commit_message>
<xml_diff>
--- a/CSAPP/Tutorials/Screenshots of Figures of CSAPP2e.docx
+++ b/CSAPP/Tutorials/Screenshots of Figures of CSAPP2e.docx
@@ -427,26 +427,11 @@
           <w:tab w:val="center" w:pos="4153"/>
         </w:tabs>
       </w:pPr>
-      <w:proofErr w:type="spellStart"/>
-      <w:r>
-        <w:rPr>
-          <w:rFonts w:hint="eastAsia"/>
-        </w:rPr>
-        <w:t>movabs</w:t>
-      </w:r>
-      <w:proofErr w:type="spellEnd"/>
-      <w:r>
-        <w:rPr>
-          <w:rFonts w:hint="eastAsia"/>
-        </w:rPr>
-        <w:t xml:space="preserve"> $0x400921fb4d12d84a, $</w:t>
-      </w:r>
-      <w:proofErr w:type="spellStart"/>
-      <w:r>
-        <w:rPr>
-          <w:rFonts w:hint="eastAsia"/>
-        </w:rPr>
-        <w:t>ea</w:t>
+      <w:r>
+        <w:rPr>
+          <w:rFonts w:hint="eastAsia"/>
+        </w:rPr>
+        <w:t>movabs $0x400921fb4d12d84a, $ea</w:t>
       </w:r>
       <w:r>
         <w:rPr>
@@ -454,7 +439,6 @@
         </w:rPr>
         <w:t>x</w:t>
       </w:r>
-      <w:proofErr w:type="spellEnd"/>
     </w:p>
     <w:p>
       <w:pPr>
@@ -462,19 +446,11 @@
           <w:tab w:val="center" w:pos="4153"/>
         </w:tabs>
       </w:pPr>
-      <w:proofErr w:type="spellStart"/>
-      <w:r>
-        <w:rPr>
-          <w:rFonts w:hint="eastAsia"/>
-        </w:rPr>
-        <w:t>movabs</w:t>
-      </w:r>
-      <w:proofErr w:type="spellEnd"/>
-      <w:r>
-        <w:rPr>
-          <w:rFonts w:hint="eastAsia"/>
-        </w:rPr>
-        <w:t xml:space="preserve">: move a full 64-bit value or a 64-bit absolute memory address. </w:t>
+      <w:r>
+        <w:rPr>
+          <w:rFonts w:hint="eastAsia"/>
+        </w:rPr>
+        <w:t xml:space="preserve">movabs: move a full 64-bit value or a 64-bit absolute memory address. </w:t>
       </w:r>
     </w:p>
     <w:p>
@@ -1129,7 +1105,6 @@
         </w:rPr>
         <w:t>“</w:t>
       </w:r>
-      <w:proofErr w:type="spellStart"/>
       <w:r>
         <w:rPr>
           <w:rFonts w:hint="eastAsia"/>
@@ -1137,7 +1112,6 @@
         </w:rPr>
         <w:t>movl</w:t>
       </w:r>
-      <w:proofErr w:type="spellEnd"/>
       <w:r>
         <w:rPr>
           <w:b/>
@@ -1951,6 +1925,177 @@
             </a:graphic>
           </wp:inline>
         </w:drawing>
+      </w:r>
+    </w:p>
+    <w:p>
+      <w:r>
+        <w:rPr>
+          <w:rFonts w:hint="eastAsia"/>
+        </w:rPr>
+        <w:t xml:space="preserve">Why is there a </w:t>
+      </w:r>
+      <w:r>
+        <w:t>“</w:t>
+      </w:r>
+      <w:r>
+        <w:rPr>
+          <w:rFonts w:hint="eastAsia"/>
+        </w:rPr>
+        <w:t>m_stat</w:t>
+      </w:r>
+      <w:r>
+        <w:t>”</w:t>
+      </w:r>
+      <w:r>
+        <w:rPr>
+          <w:rFonts w:hint="eastAsia"/>
+        </w:rPr>
+        <w:t xml:space="preserve"> with a lower case of </w:t>
+      </w:r>
+      <w:r>
+        <w:t>“</w:t>
+      </w:r>
+      <w:r>
+        <w:rPr>
+          <w:rFonts w:hint="eastAsia"/>
+        </w:rPr>
+        <w:t>m</w:t>
+      </w:r>
+      <w:r>
+        <w:t>”</w:t>
+      </w:r>
+      <w:r>
+        <w:rPr>
+          <w:rFonts w:hint="eastAsia"/>
+        </w:rPr>
+        <w:t xml:space="preserve">, but </w:t>
+      </w:r>
+      <w:r>
+        <w:rPr>
+          <w:rFonts w:hint="eastAsia"/>
+        </w:rPr>
+        <w:t>isn</w:t>
+      </w:r>
+      <w:r>
+        <w:t>’</w:t>
+      </w:r>
+      <w:r>
+        <w:rPr>
+          <w:rFonts w:hint="eastAsia"/>
+        </w:rPr>
+        <w:t xml:space="preserve">t there a </w:t>
+      </w:r>
+      <w:r>
+        <w:t>“</w:t>
+      </w:r>
+      <w:r>
+        <w:rPr>
+          <w:rFonts w:hint="eastAsia"/>
+        </w:rPr>
+        <w:t>w_stat</w:t>
+      </w:r>
+      <w:r>
+        <w:t>”</w:t>
+      </w:r>
+      <w:r>
+        <w:rPr>
+          <w:rFonts w:hint="eastAsia"/>
+        </w:rPr>
+        <w:t xml:space="preserve"> with </w:t>
+      </w:r>
+      <w:r>
+        <w:t>“</w:t>
+      </w:r>
+      <w:r>
+        <w:rPr>
+          <w:rFonts w:hint="eastAsia"/>
+        </w:rPr>
+        <w:t>w</w:t>
+      </w:r>
+      <w:r>
+        <w:t>”</w:t>
+      </w:r>
+      <w:r>
+        <w:rPr>
+          <w:rFonts w:hint="eastAsia"/>
+        </w:rPr>
+        <w:t xml:space="preserve"> in the Write back stage?</w:t>
+      </w:r>
+    </w:p>
+    <w:p>
+      <w:pPr>
+        <w:rPr>
+          <w:rFonts w:hint="eastAsia"/>
+        </w:rPr>
+      </w:pPr>
+      <w:r>
+        <w:rPr>
+          <w:rFonts w:hint="eastAsia"/>
+        </w:rPr>
+        <w:t>The reason is that the Write Back stage doesn</w:t>
+      </w:r>
+      <w:r>
+        <w:t>’</w:t>
+      </w:r>
+      <w:r>
+        <w:rPr>
+          <w:rFonts w:hint="eastAsia"/>
+        </w:rPr>
+        <w:t xml:space="preserve">t cause errors, the value of </w:t>
+      </w:r>
+      <w:r>
+        <w:t>“</w:t>
+      </w:r>
+      <w:r>
+        <w:rPr>
+          <w:rFonts w:hint="eastAsia"/>
+        </w:rPr>
+        <w:t>W_stat</w:t>
+      </w:r>
+      <w:r>
+        <w:t>”</w:t>
+      </w:r>
+      <w:r>
+        <w:rPr>
+          <w:rFonts w:hint="eastAsia"/>
+        </w:rPr>
+        <w:t xml:space="preserve"> is passed from the Memory Stage. </w:t>
+      </w:r>
+      <w:r>
+        <w:t>“</w:t>
+      </w:r>
+      <w:r>
+        <w:rPr>
+          <w:rFonts w:hint="eastAsia"/>
+        </w:rPr>
+        <w:t>m_stat</w:t>
+      </w:r>
+      <w:r>
+        <w:t>”</w:t>
+      </w:r>
+      <w:r>
+        <w:rPr>
+          <w:rFonts w:hint="eastAsia"/>
+        </w:rPr>
+        <w:t xml:space="preserve"> represents an error generated by the logic in the Memory Stage, while </w:t>
+      </w:r>
+      <w:r>
+        <w:t>“</w:t>
+      </w:r>
+      <w:r>
+        <w:rPr>
+          <w:rFonts w:hint="eastAsia"/>
+        </w:rPr>
+        <w:t>M_stat</w:t>
+      </w:r>
+      <w:r>
+        <w:t>”</w:t>
+      </w:r>
+      <w:r>
+        <w:rPr>
+          <w:rFonts w:hint="eastAsia"/>
+        </w:rPr>
+        <w:t xml:space="preserve"> is the value in the pipeline register M.</w:t>
       </w:r>
     </w:p>
     <w:sectPr>

</xml_diff>

<commit_message>
add answer of problem 5.8
</commit_message>
<xml_diff>
--- a/CSAPP/Tutorials/Screenshots of Figures of CSAPP2e.docx
+++ b/CSAPP/Tutorials/Screenshots of Figures of CSAPP2e.docx
@@ -516,23 +516,18 @@
       <w:pPr>
         <w:outlineLvl w:val="1"/>
         <w:rPr>
-          <w:rFonts w:ascii="Times New Roman" w:hAnsi="Times New Roman" w:cs="Times New Roman"/>
-          <w:b/>
-        </w:rPr>
-      </w:pPr>
-      <w:r>
-        <w:rPr>
           <w:rFonts w:ascii="Times New Roman" w:hAnsi="Times New Roman" w:cs="Times New Roman" w:hint="eastAsia"/>
           <w:b/>
-        </w:rPr>
-        <w:t>Conditional Codes</w:t>
-      </w:r>
+          <w:sz w:val="24"/>
+        </w:rPr>
+      </w:pPr>
       <w:r>
         <w:rPr>
           <w:rFonts w:ascii="Times New Roman" w:hAnsi="Times New Roman" w:cs="Times New Roman" w:hint="eastAsia"/>
           <w:b/>
-        </w:rPr>
-        <w:t xml:space="preserve">  (Page 219)</w:t>
+          <w:sz w:val="24"/>
+        </w:rPr>
+        <w:t>Special Arithmetic Operations</w:t>
       </w:r>
     </w:p>
     <w:p>
@@ -548,10 +543,10 @@
           <w:noProof/>
         </w:rPr>
         <w:drawing>
-          <wp:inline distT="0" distB="0" distL="0" distR="0" wp14:anchorId="191CE508" wp14:editId="6A7F5491">
-            <wp:extent cx="5274310" cy="2370621"/>
+          <wp:inline distT="0" distB="0" distL="0" distR="0" wp14:anchorId="73755C6A" wp14:editId="2CCD25A1">
+            <wp:extent cx="5274310" cy="2651125"/>
             <wp:effectExtent l="0" t="0" r="2540" b="0"/>
-            <wp:docPr id="5" name="图片 5"/>
+            <wp:docPr id="1509857674" name="Picture 1"/>
             <wp:cNvGraphicFramePr>
               <a:graphicFrameLocks xmlns:a="http://schemas.openxmlformats.org/drawingml/2006/main" noChangeAspect="1"/>
             </wp:cNvGraphicFramePr>
@@ -559,7 +554,7 @@
               <a:graphicData uri="http://schemas.openxmlformats.org/drawingml/2006/picture">
                 <pic:pic xmlns:pic="http://schemas.openxmlformats.org/drawingml/2006/picture">
                   <pic:nvPicPr>
-                    <pic:cNvPr id="0" name=""/>
+                    <pic:cNvPr id="1509857674" name=""/>
                     <pic:cNvPicPr/>
                   </pic:nvPicPr>
                   <pic:blipFill>
@@ -571,7 +566,7 @@
                   <pic:spPr>
                     <a:xfrm>
                       <a:off x="0" y="0"/>
-                      <a:ext cx="5274310" cy="2370621"/>
+                      <a:ext cx="5274310" cy="2651125"/>
                     </a:xfrm>
                     <a:prstGeom prst="rect">
                       <a:avLst/>
@@ -597,7 +592,14 @@
           <w:rFonts w:ascii="Times New Roman" w:hAnsi="Times New Roman" w:cs="Times New Roman" w:hint="eastAsia"/>
           <w:b/>
         </w:rPr>
-        <w:t>The SET instructions</w:t>
+        <w:t>Conditional Codes</w:t>
+      </w:r>
+      <w:r>
+        <w:rPr>
+          <w:rFonts w:ascii="Times New Roman" w:hAnsi="Times New Roman" w:cs="Times New Roman" w:hint="eastAsia"/>
+          <w:b/>
+        </w:rPr>
+        <w:t xml:space="preserve"> (Page 219)</w:t>
       </w:r>
     </w:p>
     <w:p>
@@ -614,10 +616,10 @@
         </w:rPr>
         <w:lastRenderedPageBreak/>
         <w:drawing>
-          <wp:inline distT="0" distB="0" distL="0" distR="0" wp14:anchorId="5855F4A5" wp14:editId="6CBBD1DB">
-            <wp:extent cx="5190476" cy="3485714"/>
-            <wp:effectExtent l="0" t="0" r="0" b="635"/>
-            <wp:docPr id="6" name="图片 6"/>
+          <wp:inline distT="0" distB="0" distL="0" distR="0" wp14:anchorId="191CE508" wp14:editId="6A7F5491">
+            <wp:extent cx="5274310" cy="2370621"/>
+            <wp:effectExtent l="0" t="0" r="2540" b="0"/>
+            <wp:docPr id="5" name="图片 5"/>
             <wp:cNvGraphicFramePr>
               <a:graphicFrameLocks xmlns:a="http://schemas.openxmlformats.org/drawingml/2006/main" noChangeAspect="1"/>
             </wp:cNvGraphicFramePr>
@@ -637,7 +639,7 @@
                   <pic:spPr>
                     <a:xfrm>
                       <a:off x="0" y="0"/>
-                      <a:ext cx="5190476" cy="3485714"/>
+                      <a:ext cx="5274310" cy="2370621"/>
                     </a:xfrm>
                     <a:prstGeom prst="rect">
                       <a:avLst/>
@@ -663,33 +665,26 @@
           <w:rFonts w:ascii="Times New Roman" w:hAnsi="Times New Roman" w:cs="Times New Roman" w:hint="eastAsia"/>
           <w:b/>
         </w:rPr>
-        <w:t>Comparison and test instructions.</w:t>
-      </w:r>
-      <w:r>
-        <w:rPr>
-          <w:rFonts w:ascii="Times New Roman" w:hAnsi="Times New Roman" w:cs="Times New Roman" w:hint="eastAsia"/>
-          <w:b/>
-        </w:rPr>
-        <w:t xml:space="preserve">  </w:t>
-      </w:r>
-      <w:r>
-        <w:rPr>
-          <w:rFonts w:ascii="Times New Roman" w:hAnsi="Times New Roman" w:cs="Times New Roman" w:hint="eastAsia"/>
-          <w:b/>
-        </w:rPr>
-        <w:t>Page 220</w:t>
-      </w:r>
-    </w:p>
-    <w:p>
+        <w:t>The SET instructions</w:t>
+      </w:r>
+    </w:p>
+    <w:p>
+      <w:pPr>
+        <w:rPr>
+          <w:rFonts w:ascii="Times New Roman" w:hAnsi="Times New Roman" w:cs="Times New Roman"/>
+          <w:b/>
+          <w:sz w:val="24"/>
+        </w:rPr>
+      </w:pPr>
       <w:r>
         <w:rPr>
           <w:noProof/>
         </w:rPr>
         <w:drawing>
-          <wp:inline distT="0" distB="0" distL="0" distR="0" wp14:anchorId="060EC3E8" wp14:editId="7F7E6143">
-            <wp:extent cx="5274310" cy="2380615"/>
-            <wp:effectExtent l="0" t="0" r="2540" b="635"/>
-            <wp:docPr id="4" name="图片 4"/>
+          <wp:inline distT="0" distB="0" distL="0" distR="0" wp14:anchorId="5855F4A5" wp14:editId="6CBBD1DB">
+            <wp:extent cx="5190476" cy="3485714"/>
+            <wp:effectExtent l="0" t="0" r="0" b="635"/>
+            <wp:docPr id="6" name="图片 6"/>
             <wp:cNvGraphicFramePr>
               <a:graphicFrameLocks xmlns:a="http://schemas.openxmlformats.org/drawingml/2006/main" noChangeAspect="1"/>
             </wp:cNvGraphicFramePr>
@@ -709,7 +704,7 @@
                   <pic:spPr>
                     <a:xfrm>
                       <a:off x="0" y="0"/>
-                      <a:ext cx="5274310" cy="2380615"/>
+                      <a:ext cx="5190476" cy="3485714"/>
                     </a:xfrm>
                     <a:prstGeom prst="rect">
                       <a:avLst/>
@@ -735,21 +730,21 @@
           <w:rFonts w:ascii="Times New Roman" w:hAnsi="Times New Roman" w:cs="Times New Roman" w:hint="eastAsia"/>
           <w:b/>
         </w:rPr>
-        <w:t>The jump instructions</w:t>
+        <w:t>Comparison and test instructions.</w:t>
       </w:r>
       <w:r>
         <w:rPr>
           <w:rFonts w:ascii="Times New Roman" w:hAnsi="Times New Roman" w:cs="Times New Roman" w:hint="eastAsia"/>
           <w:b/>
         </w:rPr>
-        <w:t xml:space="preserve">. </w:t>
-      </w:r>
-      <w:r>
-        <w:rPr>
-          <w:rFonts w:ascii="Times New Roman" w:hAnsi="Times New Roman" w:cs="Times New Roman"/>
-          <w:b/>
-        </w:rPr>
-        <w:t>Page 224</w:t>
+        <w:t xml:space="preserve">  </w:t>
+      </w:r>
+      <w:r>
+        <w:rPr>
+          <w:rFonts w:ascii="Times New Roman" w:hAnsi="Times New Roman" w:cs="Times New Roman" w:hint="eastAsia"/>
+          <w:b/>
+        </w:rPr>
+        <w:t>Page 220</w:t>
       </w:r>
     </w:p>
     <w:p>
@@ -759,10 +754,10 @@
         </w:rPr>
         <w:lastRenderedPageBreak/>
         <w:drawing>
-          <wp:inline distT="0" distB="0" distL="0" distR="0" wp14:anchorId="38D5A206" wp14:editId="260C4C6C">
-            <wp:extent cx="5274310" cy="3845241"/>
-            <wp:effectExtent l="0" t="0" r="2540" b="3175"/>
-            <wp:docPr id="3" name="图片 3"/>
+          <wp:inline distT="0" distB="0" distL="0" distR="0" wp14:anchorId="060EC3E8" wp14:editId="7F7E6143">
+            <wp:extent cx="5274310" cy="2380615"/>
+            <wp:effectExtent l="0" t="0" r="2540" b="635"/>
+            <wp:docPr id="4" name="图片 4"/>
             <wp:cNvGraphicFramePr>
               <a:graphicFrameLocks xmlns:a="http://schemas.openxmlformats.org/drawingml/2006/main" noChangeAspect="1"/>
             </wp:cNvGraphicFramePr>
@@ -782,6 +777,78 @@
                   <pic:spPr>
                     <a:xfrm>
                       <a:off x="0" y="0"/>
+                      <a:ext cx="5274310" cy="2380615"/>
+                    </a:xfrm>
+                    <a:prstGeom prst="rect">
+                      <a:avLst/>
+                    </a:prstGeom>
+                  </pic:spPr>
+                </pic:pic>
+              </a:graphicData>
+            </a:graphic>
+          </wp:inline>
+        </w:drawing>
+      </w:r>
+    </w:p>
+    <w:p>
+      <w:pPr>
+        <w:outlineLvl w:val="1"/>
+        <w:rPr>
+          <w:rFonts w:ascii="Times New Roman" w:hAnsi="Times New Roman" w:cs="Times New Roman"/>
+          <w:b/>
+        </w:rPr>
+      </w:pPr>
+      <w:r>
+        <w:rPr>
+          <w:rFonts w:ascii="Times New Roman" w:hAnsi="Times New Roman" w:cs="Times New Roman" w:hint="eastAsia"/>
+          <w:b/>
+        </w:rPr>
+        <w:t>The jump instructions</w:t>
+      </w:r>
+      <w:r>
+        <w:rPr>
+          <w:rFonts w:ascii="Times New Roman" w:hAnsi="Times New Roman" w:cs="Times New Roman" w:hint="eastAsia"/>
+          <w:b/>
+        </w:rPr>
+        <w:t xml:space="preserve">. </w:t>
+      </w:r>
+      <w:r>
+        <w:rPr>
+          <w:rFonts w:ascii="Times New Roman" w:hAnsi="Times New Roman" w:cs="Times New Roman"/>
+          <w:b/>
+        </w:rPr>
+        <w:t>Page 224</w:t>
+      </w:r>
+    </w:p>
+    <w:p>
+      <w:r>
+        <w:rPr>
+          <w:noProof/>
+        </w:rPr>
+        <w:drawing>
+          <wp:inline distT="0" distB="0" distL="0" distR="0" wp14:anchorId="38D5A206" wp14:editId="260C4C6C">
+            <wp:extent cx="5274310" cy="3845241"/>
+            <wp:effectExtent l="0" t="0" r="2540" b="3175"/>
+            <wp:docPr id="3" name="图片 3"/>
+            <wp:cNvGraphicFramePr>
+              <a:graphicFrameLocks xmlns:a="http://schemas.openxmlformats.org/drawingml/2006/main" noChangeAspect="1"/>
+            </wp:cNvGraphicFramePr>
+            <a:graphic xmlns:a="http://schemas.openxmlformats.org/drawingml/2006/main">
+              <a:graphicData uri="http://schemas.openxmlformats.org/drawingml/2006/picture">
+                <pic:pic xmlns:pic="http://schemas.openxmlformats.org/drawingml/2006/picture">
+                  <pic:nvPicPr>
+                    <pic:cNvPr id="0" name=""/>
+                    <pic:cNvPicPr/>
+                  </pic:nvPicPr>
+                  <pic:blipFill>
+                    <a:blip r:embed="rId15"/>
+                    <a:stretch>
+                      <a:fillRect/>
+                    </a:stretch>
+                  </pic:blipFill>
+                  <pic:spPr>
+                    <a:xfrm>
+                      <a:off x="0" y="0"/>
                       <a:ext cx="5274310" cy="3845241"/>
                     </a:xfrm>
                     <a:prstGeom prst="rect">
@@ -823,6 +890,7 @@
         <w:rPr>
           <w:noProof/>
         </w:rPr>
+        <w:lastRenderedPageBreak/>
         <w:drawing>
           <wp:inline distT="0" distB="0" distL="0" distR="0" wp14:anchorId="42AC5C52" wp14:editId="2AFFFB96">
             <wp:extent cx="5274310" cy="3479800"/>
@@ -839,7 +907,7 @@
                     <pic:cNvPicPr/>
                   </pic:nvPicPr>
                   <pic:blipFill>
-                    <a:blip r:embed="rId15"/>
+                    <a:blip r:embed="rId16"/>
                     <a:stretch>
                       <a:fillRect/>
                     </a:stretch>
@@ -876,7 +944,6 @@
           <w:rFonts w:ascii="Times New Roman" w:hAnsi="Times New Roman" w:cs="Times New Roman" w:hint="eastAsia"/>
           <w:b/>
         </w:rPr>
-        <w:lastRenderedPageBreak/>
         <w:t>Y86 Instruction Set Page 372</w:t>
       </w:r>
     </w:p>
@@ -890,48 +957,6 @@
             <wp:extent cx="5274310" cy="1990075"/>
             <wp:effectExtent l="0" t="0" r="2540" b="0"/>
             <wp:docPr id="11" name="图片 11"/>
-            <wp:cNvGraphicFramePr>
-              <a:graphicFrameLocks xmlns:a="http://schemas.openxmlformats.org/drawingml/2006/main" noChangeAspect="1"/>
-            </wp:cNvGraphicFramePr>
-            <a:graphic xmlns:a="http://schemas.openxmlformats.org/drawingml/2006/main">
-              <a:graphicData uri="http://schemas.openxmlformats.org/drawingml/2006/picture">
-                <pic:pic xmlns:pic="http://schemas.openxmlformats.org/drawingml/2006/picture">
-                  <pic:nvPicPr>
-                    <pic:cNvPr id="0" name=""/>
-                    <pic:cNvPicPr/>
-                  </pic:nvPicPr>
-                  <pic:blipFill>
-                    <a:blip r:embed="rId16"/>
-                    <a:stretch>
-                      <a:fillRect/>
-                    </a:stretch>
-                  </pic:blipFill>
-                  <pic:spPr>
-                    <a:xfrm>
-                      <a:off x="0" y="0"/>
-                      <a:ext cx="5274310" cy="1990075"/>
-                    </a:xfrm>
-                    <a:prstGeom prst="rect">
-                      <a:avLst/>
-                    </a:prstGeom>
-                  </pic:spPr>
-                </pic:pic>
-              </a:graphicData>
-            </a:graphic>
-          </wp:inline>
-        </w:drawing>
-      </w:r>
-    </w:p>
-    <w:p>
-      <w:r>
-        <w:rPr>
-          <w:noProof/>
-        </w:rPr>
-        <w:drawing>
-          <wp:inline distT="0" distB="0" distL="0" distR="0" wp14:anchorId="4624F87E" wp14:editId="77CC2441">
-            <wp:extent cx="5274310" cy="3636466"/>
-            <wp:effectExtent l="0" t="0" r="2540" b="2540"/>
-            <wp:docPr id="8" name="图片 8"/>
             <wp:cNvGraphicFramePr>
               <a:graphicFrameLocks xmlns:a="http://schemas.openxmlformats.org/drawingml/2006/main" noChangeAspect="1"/>
             </wp:cNvGraphicFramePr>
@@ -951,7 +976,7 @@
                   <pic:spPr>
                     <a:xfrm>
                       <a:off x="0" y="0"/>
-                      <a:ext cx="5274310" cy="3636466"/>
+                      <a:ext cx="5274310" cy="1990075"/>
                     </a:xfrm>
                     <a:prstGeom prst="rect">
                       <a:avLst/>
@@ -969,11 +994,12 @@
         <w:rPr>
           <w:noProof/>
         </w:rPr>
+        <w:lastRenderedPageBreak/>
         <w:drawing>
-          <wp:inline distT="0" distB="0" distL="0" distR="0" wp14:anchorId="6B6CCE07" wp14:editId="5A17264C">
-            <wp:extent cx="5274310" cy="2264779"/>
+          <wp:inline distT="0" distB="0" distL="0" distR="0" wp14:anchorId="4624F87E" wp14:editId="77CC2441">
+            <wp:extent cx="5274310" cy="3636466"/>
             <wp:effectExtent l="0" t="0" r="2540" b="2540"/>
-            <wp:docPr id="9" name="图片 9"/>
+            <wp:docPr id="8" name="图片 8"/>
             <wp:cNvGraphicFramePr>
               <a:graphicFrameLocks xmlns:a="http://schemas.openxmlformats.org/drawingml/2006/main" noChangeAspect="1"/>
             </wp:cNvGraphicFramePr>
@@ -993,7 +1019,7 @@
                   <pic:spPr>
                     <a:xfrm>
                       <a:off x="0" y="0"/>
-                      <a:ext cx="5274310" cy="2264779"/>
+                      <a:ext cx="5274310" cy="3636466"/>
                     </a:xfrm>
                     <a:prstGeom prst="rect">
                       <a:avLst/>
@@ -1007,178 +1033,15 @@
       </w:r>
     </w:p>
     <w:p>
-      <w:pPr>
-        <w:rPr>
-          <w:b/>
-        </w:rPr>
-      </w:pPr>
-      <w:r>
-        <w:rPr>
-          <w:rFonts w:hint="eastAsia"/>
-          <w:b/>
-        </w:rPr>
-        <w:lastRenderedPageBreak/>
-        <w:t xml:space="preserve">Note that in </w:t>
-      </w:r>
-      <w:r>
-        <w:rPr>
-          <w:rFonts w:hint="eastAsia"/>
-          <w:b/>
-        </w:rPr>
-        <w:t xml:space="preserve">the above </w:t>
-      </w:r>
-      <w:r>
-        <w:rPr>
-          <w:rFonts w:hint="eastAsia"/>
-          <w:b/>
-        </w:rPr>
-        <w:t xml:space="preserve">conditional moves </w:t>
-      </w:r>
-      <w:r>
-        <w:rPr>
-          <w:b/>
-        </w:rPr>
-        <w:t>“</w:t>
-      </w:r>
-      <w:r>
-        <w:rPr>
-          <w:rFonts w:hint="eastAsia"/>
-          <w:b/>
-        </w:rPr>
-        <w:t>l</w:t>
-      </w:r>
-      <w:r>
-        <w:rPr>
-          <w:b/>
-        </w:rPr>
-        <w:t>”</w:t>
-      </w:r>
-      <w:r>
-        <w:rPr>
-          <w:rFonts w:hint="eastAsia"/>
-          <w:b/>
-        </w:rPr>
-        <w:t xml:space="preserve"> doesn</w:t>
-      </w:r>
-      <w:r>
-        <w:rPr>
-          <w:b/>
-        </w:rPr>
-        <w:t>’</w:t>
-      </w:r>
-      <w:r>
-        <w:rPr>
-          <w:rFonts w:hint="eastAsia"/>
-          <w:b/>
-        </w:rPr>
-        <w:t xml:space="preserve">t represent </w:t>
-      </w:r>
-      <w:r>
-        <w:rPr>
-          <w:b/>
-        </w:rPr>
-        <w:t>“</w:t>
-      </w:r>
-      <w:r>
-        <w:rPr>
-          <w:rFonts w:hint="eastAsia"/>
-          <w:b/>
-        </w:rPr>
-        <w:t>double words</w:t>
-      </w:r>
-      <w:r>
-        <w:rPr>
-          <w:b/>
-        </w:rPr>
-        <w:t>”</w:t>
-      </w:r>
-      <w:r>
-        <w:rPr>
-          <w:rFonts w:hint="eastAsia"/>
-          <w:b/>
-        </w:rPr>
-        <w:t xml:space="preserve"> as in </w:t>
-      </w:r>
-      <w:r>
-        <w:rPr>
-          <w:b/>
-        </w:rPr>
-        <w:t>“</w:t>
-      </w:r>
-      <w:r>
-        <w:rPr>
-          <w:rFonts w:hint="eastAsia"/>
-          <w:b/>
-        </w:rPr>
-        <w:t>movl</w:t>
-      </w:r>
-      <w:r>
-        <w:rPr>
-          <w:b/>
-        </w:rPr>
-        <w:t>”</w:t>
-      </w:r>
-      <w:r>
-        <w:rPr>
-          <w:rFonts w:hint="eastAsia"/>
-          <w:b/>
-        </w:rPr>
-        <w:t xml:space="preserve">, but represents </w:t>
-      </w:r>
-      <w:r>
-        <w:rPr>
-          <w:b/>
-        </w:rPr>
-        <w:t>“</w:t>
-      </w:r>
-      <w:r>
-        <w:rPr>
-          <w:rFonts w:hint="eastAsia"/>
-          <w:b/>
-        </w:rPr>
-        <w:t>less</w:t>
-      </w:r>
-      <w:r>
-        <w:rPr>
-          <w:b/>
-        </w:rPr>
-        <w:t>”</w:t>
-      </w:r>
-      <w:r>
-        <w:rPr>
-          <w:rFonts w:hint="eastAsia"/>
-          <w:b/>
-        </w:rPr>
-        <w:t>.</w:t>
-      </w:r>
-    </w:p>
-    <w:p>
-      <w:pPr>
-        <w:outlineLvl w:val="1"/>
-        <w:rPr>
-          <w:rFonts w:ascii="Times New Roman" w:hAnsi="Times New Roman" w:cs="Times New Roman"/>
-          <w:b/>
-        </w:rPr>
-      </w:pPr>
-      <w:r>
-        <w:rPr>
-          <w:rFonts w:ascii="Times New Roman" w:hAnsi="Times New Roman" w:cs="Times New Roman" w:hint="eastAsia"/>
-          <w:b/>
-        </w:rPr>
-        <w:t>Y86 Register Identifiers</w:t>
-      </w:r>
-    </w:p>
-    <w:p/>
-    <w:p>
       <w:r>
         <w:rPr>
           <w:noProof/>
         </w:rPr>
         <w:drawing>
-          <wp:inline distT="0" distB="0" distL="0" distR="0" wp14:anchorId="7DE6058B" wp14:editId="61D899E9">
-            <wp:extent cx="5274310" cy="2711630"/>
-            <wp:effectExtent l="0" t="0" r="2540" b="0"/>
-            <wp:docPr id="10" name="图片 10"/>
+          <wp:inline distT="0" distB="0" distL="0" distR="0" wp14:anchorId="6B6CCE07" wp14:editId="5A17264C">
+            <wp:extent cx="5274310" cy="2264779"/>
+            <wp:effectExtent l="0" t="0" r="2540" b="2540"/>
+            <wp:docPr id="9" name="图片 9"/>
             <wp:cNvGraphicFramePr>
               <a:graphicFrameLocks xmlns:a="http://schemas.openxmlformats.org/drawingml/2006/main" noChangeAspect="1"/>
             </wp:cNvGraphicFramePr>
@@ -1198,7 +1061,7 @@
                   <pic:spPr>
                     <a:xfrm>
                       <a:off x="0" y="0"/>
-                      <a:ext cx="5274310" cy="2711630"/>
+                      <a:ext cx="5274310" cy="2264779"/>
                     </a:xfrm>
                     <a:prstGeom prst="rect">
                       <a:avLst/>
@@ -1213,33 +1076,182 @@
     </w:p>
     <w:p>
       <w:pPr>
+        <w:rPr>
+          <w:b/>
+        </w:rPr>
+      </w:pPr>
+      <w:r>
+        <w:rPr>
+          <w:rFonts w:hint="eastAsia"/>
+          <w:b/>
+        </w:rPr>
+        <w:t xml:space="preserve">Note that in </w:t>
+      </w:r>
+      <w:r>
+        <w:rPr>
+          <w:rFonts w:hint="eastAsia"/>
+          <w:b/>
+        </w:rPr>
+        <w:t xml:space="preserve">the above </w:t>
+      </w:r>
+      <w:r>
+        <w:rPr>
+          <w:rFonts w:hint="eastAsia"/>
+          <w:b/>
+        </w:rPr>
+        <w:t xml:space="preserve">conditional </w:t>
+      </w:r>
+      <w:proofErr w:type="gramStart"/>
+      <w:r>
+        <w:rPr>
+          <w:rFonts w:hint="eastAsia"/>
+          <w:b/>
+        </w:rPr>
+        <w:t>moves</w:t>
+      </w:r>
+      <w:proofErr w:type="gramEnd"/>
+      <w:r>
+        <w:rPr>
+          <w:rFonts w:hint="eastAsia"/>
+          <w:b/>
+        </w:rPr>
+        <w:t xml:space="preserve"> </w:t>
+      </w:r>
+      <w:r>
+        <w:rPr>
+          <w:b/>
+        </w:rPr>
+        <w:t>“</w:t>
+      </w:r>
+      <w:r>
+        <w:rPr>
+          <w:rFonts w:hint="eastAsia"/>
+          <w:b/>
+        </w:rPr>
+        <w:t>l</w:t>
+      </w:r>
+      <w:r>
+        <w:rPr>
+          <w:b/>
+        </w:rPr>
+        <w:t>”</w:t>
+      </w:r>
+      <w:r>
+        <w:rPr>
+          <w:rFonts w:hint="eastAsia"/>
+          <w:b/>
+        </w:rPr>
+        <w:t xml:space="preserve"> doesn</w:t>
+      </w:r>
+      <w:r>
+        <w:rPr>
+          <w:b/>
+        </w:rPr>
+        <w:t>’</w:t>
+      </w:r>
+      <w:r>
+        <w:rPr>
+          <w:rFonts w:hint="eastAsia"/>
+          <w:b/>
+        </w:rPr>
+        <w:t xml:space="preserve">t represent </w:t>
+      </w:r>
+      <w:r>
+        <w:rPr>
+          <w:b/>
+        </w:rPr>
+        <w:t>“</w:t>
+      </w:r>
+      <w:r>
+        <w:rPr>
+          <w:rFonts w:hint="eastAsia"/>
+          <w:b/>
+        </w:rPr>
+        <w:t>double words</w:t>
+      </w:r>
+      <w:r>
+        <w:rPr>
+          <w:b/>
+        </w:rPr>
+        <w:t>”</w:t>
+      </w:r>
+      <w:r>
+        <w:rPr>
+          <w:rFonts w:hint="eastAsia"/>
+          <w:b/>
+        </w:rPr>
+        <w:t xml:space="preserve"> as in </w:t>
+      </w:r>
+      <w:r>
+        <w:rPr>
+          <w:b/>
+        </w:rPr>
+        <w:t>“</w:t>
+      </w:r>
+      <w:r>
+        <w:rPr>
+          <w:rFonts w:hint="eastAsia"/>
+          <w:b/>
+        </w:rPr>
+        <w:t>movl</w:t>
+      </w:r>
+      <w:r>
+        <w:rPr>
+          <w:b/>
+        </w:rPr>
+        <w:t>”</w:t>
+      </w:r>
+      <w:r>
+        <w:rPr>
+          <w:rFonts w:hint="eastAsia"/>
+          <w:b/>
+        </w:rPr>
+        <w:t xml:space="preserve">, but represents </w:t>
+      </w:r>
+      <w:r>
+        <w:rPr>
+          <w:b/>
+        </w:rPr>
+        <w:t>“</w:t>
+      </w:r>
+      <w:r>
+        <w:rPr>
+          <w:rFonts w:hint="eastAsia"/>
+          <w:b/>
+        </w:rPr>
+        <w:t>less</w:t>
+      </w:r>
+      <w:r>
+        <w:rPr>
+          <w:b/>
+        </w:rPr>
+        <w:t>”</w:t>
+      </w:r>
+      <w:r>
+        <w:rPr>
+          <w:rFonts w:hint="eastAsia"/>
+          <w:b/>
+        </w:rPr>
+        <w:t>.</w:t>
+      </w:r>
+    </w:p>
+    <w:p>
+      <w:pPr>
         <w:outlineLvl w:val="1"/>
         <w:rPr>
           <w:rFonts w:ascii="Times New Roman" w:hAnsi="Times New Roman" w:cs="Times New Roman"/>
           <w:b/>
-          <w:sz w:val="24"/>
-          <w:szCs w:val="24"/>
         </w:rPr>
       </w:pPr>
       <w:r>
         <w:rPr>
           <w:rFonts w:ascii="Times New Roman" w:hAnsi="Times New Roman" w:cs="Times New Roman" w:hint="eastAsia"/>
           <w:b/>
-          <w:sz w:val="24"/>
-          <w:szCs w:val="24"/>
-        </w:rPr>
-        <w:t xml:space="preserve">Figure 4.26 </w:t>
-      </w:r>
-      <w:r>
-        <w:rPr>
-          <w:rFonts w:ascii="Times New Roman" w:hAnsi="Times New Roman" w:cs="Times New Roman" w:hint="eastAsia"/>
-          <w:b/>
-          <w:sz w:val="24"/>
-          <w:szCs w:val="24"/>
-        </w:rPr>
-        <w:t xml:space="preserve">Constant Values Used in HCL Descriptions </w:t>
-      </w:r>
-    </w:p>
+        </w:rPr>
+        <w:t>Y86 Register Identifiers</w:t>
+      </w:r>
+    </w:p>
+    <w:p/>
     <w:p>
       <w:r>
         <w:rPr>
@@ -1247,10 +1259,10 @@
         </w:rPr>
         <w:lastRenderedPageBreak/>
         <w:drawing>
-          <wp:inline distT="0" distB="0" distL="0" distR="0" wp14:anchorId="6C6B9ED1" wp14:editId="0320CB50">
-            <wp:extent cx="5274310" cy="5172364"/>
-            <wp:effectExtent l="0" t="0" r="2540" b="9525"/>
-            <wp:docPr id="15" name="图片 15"/>
+          <wp:inline distT="0" distB="0" distL="0" distR="0" wp14:anchorId="7DE6058B" wp14:editId="61D899E9">
+            <wp:extent cx="5274310" cy="2711630"/>
+            <wp:effectExtent l="0" t="0" r="2540" b="0"/>
+            <wp:docPr id="10" name="图片 10"/>
             <wp:cNvGraphicFramePr>
               <a:graphicFrameLocks xmlns:a="http://schemas.openxmlformats.org/drawingml/2006/main" noChangeAspect="1"/>
             </wp:cNvGraphicFramePr>
@@ -1270,6 +1282,77 @@
                   <pic:spPr>
                     <a:xfrm>
                       <a:off x="0" y="0"/>
+                      <a:ext cx="5274310" cy="2711630"/>
+                    </a:xfrm>
+                    <a:prstGeom prst="rect">
+                      <a:avLst/>
+                    </a:prstGeom>
+                  </pic:spPr>
+                </pic:pic>
+              </a:graphicData>
+            </a:graphic>
+          </wp:inline>
+        </w:drawing>
+      </w:r>
+    </w:p>
+    <w:p>
+      <w:pPr>
+        <w:outlineLvl w:val="1"/>
+        <w:rPr>
+          <w:rFonts w:ascii="Times New Roman" w:hAnsi="Times New Roman" w:cs="Times New Roman"/>
+          <w:b/>
+          <w:sz w:val="24"/>
+          <w:szCs w:val="24"/>
+        </w:rPr>
+      </w:pPr>
+      <w:r>
+        <w:rPr>
+          <w:rFonts w:ascii="Times New Roman" w:hAnsi="Times New Roman" w:cs="Times New Roman" w:hint="eastAsia"/>
+          <w:b/>
+          <w:sz w:val="24"/>
+          <w:szCs w:val="24"/>
+        </w:rPr>
+        <w:t xml:space="preserve">Figure 4.26 </w:t>
+      </w:r>
+      <w:r>
+        <w:rPr>
+          <w:rFonts w:ascii="Times New Roman" w:hAnsi="Times New Roman" w:cs="Times New Roman" w:hint="eastAsia"/>
+          <w:b/>
+          <w:sz w:val="24"/>
+          <w:szCs w:val="24"/>
+        </w:rPr>
+        <w:t xml:space="preserve">Constant Values Used in HCL Descriptions </w:t>
+      </w:r>
+    </w:p>
+    <w:p>
+      <w:r>
+        <w:rPr>
+          <w:noProof/>
+        </w:rPr>
+        <w:drawing>
+          <wp:inline distT="0" distB="0" distL="0" distR="0" wp14:anchorId="6C6B9ED1" wp14:editId="0320CB50">
+            <wp:extent cx="5274310" cy="5172364"/>
+            <wp:effectExtent l="0" t="0" r="2540" b="9525"/>
+            <wp:docPr id="15" name="图片 15"/>
+            <wp:cNvGraphicFramePr>
+              <a:graphicFrameLocks xmlns:a="http://schemas.openxmlformats.org/drawingml/2006/main" noChangeAspect="1"/>
+            </wp:cNvGraphicFramePr>
+            <a:graphic xmlns:a="http://schemas.openxmlformats.org/drawingml/2006/main">
+              <a:graphicData uri="http://schemas.openxmlformats.org/drawingml/2006/picture">
+                <pic:pic xmlns:pic="http://schemas.openxmlformats.org/drawingml/2006/picture">
+                  <pic:nvPicPr>
+                    <pic:cNvPr id="0" name=""/>
+                    <pic:cNvPicPr/>
+                  </pic:nvPicPr>
+                  <pic:blipFill>
+                    <a:blip r:embed="rId21"/>
+                    <a:stretch>
+                      <a:fillRect/>
+                    </a:stretch>
+                  </pic:blipFill>
+                  <pic:spPr>
+                    <a:xfrm>
+                      <a:off x="0" y="0"/>
                       <a:ext cx="5274310" cy="5172364"/>
                     </a:xfrm>
                     <a:prstGeom prst="rect">
@@ -1301,6 +1384,7 @@
           <w:sz w:val="24"/>
           <w:szCs w:val="24"/>
         </w:rPr>
+        <w:lastRenderedPageBreak/>
         <w:t>Computational in Sequential Implementation of Y86</w:t>
       </w:r>
     </w:p>
@@ -1309,7 +1393,6 @@
         <w:rPr>
           <w:noProof/>
         </w:rPr>
-        <w:lastRenderedPageBreak/>
         <w:drawing>
           <wp:inline distT="0" distB="0" distL="0" distR="0" wp14:anchorId="7D70B96B" wp14:editId="799A85CD">
             <wp:extent cx="5274310" cy="4109720"/>
@@ -1326,7 +1409,7 @@
                     <pic:cNvPicPr/>
                   </pic:nvPicPr>
                   <pic:blipFill>
-                    <a:blip r:embed="rId21"/>
+                    <a:blip r:embed="rId22"/>
                     <a:stretch>
                       <a:fillRect/>
                     </a:stretch>
@@ -1368,7 +1451,7 @@
                     <pic:cNvPicPr/>
                   </pic:nvPicPr>
                   <pic:blipFill>
-                    <a:blip r:embed="rId22"/>
+                    <a:blip r:embed="rId23"/>
                     <a:stretch>
                       <a:fillRect/>
                     </a:stretch>
@@ -1411,7 +1494,7 @@
                     <pic:cNvPicPr/>
                   </pic:nvPicPr>
                   <pic:blipFill>
-                    <a:blip r:embed="rId23"/>
+                    <a:blip r:embed="rId24"/>
                     <a:stretch>
                       <a:fillRect/>
                     </a:stretch>
@@ -1453,7 +1536,7 @@
                     <pic:cNvPicPr/>
                   </pic:nvPicPr>
                   <pic:blipFill>
-                    <a:blip r:embed="rId24"/>
+                    <a:blip r:embed="rId25"/>
                     <a:stretch>
                       <a:fillRect/>
                     </a:stretch>
@@ -1496,7 +1579,7 @@
                     <pic:cNvPicPr/>
                   </pic:nvPicPr>
                   <pic:blipFill>
-                    <a:blip r:embed="rId25"/>
+                    <a:blip r:embed="rId26"/>
                     <a:stretch>
                       <a:fillRect/>
                     </a:stretch>
@@ -1530,15 +1613,33 @@
           <w:b/>
           <w:bCs/>
         </w:rPr>
-        <w:t>Conditional Moves</w:t>
-      </w:r>
+        <w:t xml:space="preserve">Conditional </w:t>
+      </w:r>
+      <w:proofErr w:type="gramStart"/>
       <w:r>
         <w:rPr>
           <w:rFonts w:hint="eastAsia"/>
           <w:b/>
           <w:bCs/>
         </w:rPr>
-        <w:t>(The is no figure for this instruction, it is a practice probl</w:t>
+        <w:t>Moves</w:t>
+      </w:r>
+      <w:r>
+        <w:rPr>
+          <w:rFonts w:hint="eastAsia"/>
+          <w:b/>
+          <w:bCs/>
+        </w:rPr>
+        <w:t>(</w:t>
+      </w:r>
+      <w:proofErr w:type="gramEnd"/>
+      <w:r>
+        <w:rPr>
+          <w:rFonts w:hint="eastAsia"/>
+          <w:b/>
+          <w:bCs/>
+        </w:rPr>
+        <w:t>The is no figure for this instruction, it is a practice probl</w:t>
       </w:r>
       <w:r>
         <w:rPr>
@@ -1586,7 +1687,7 @@
                     <pic:cNvPicPr/>
                   </pic:nvPicPr>
                   <pic:blipFill>
-                    <a:blip r:embed="rId26"/>
+                    <a:blip r:embed="rId27"/>
                     <a:stretch>
                       <a:fillRect/>
                     </a:stretch>
@@ -1654,7 +1755,7 @@
                     <pic:cNvPicPr/>
                   </pic:nvPicPr>
                   <pic:blipFill>
-                    <a:blip r:embed="rId27"/>
+                    <a:blip r:embed="rId28"/>
                     <a:stretch>
                       <a:fillRect/>
                     </a:stretch>
@@ -1717,7 +1818,7 @@
                     <pic:cNvPicPr/>
                   </pic:nvPicPr>
                   <pic:blipFill>
-                    <a:blip r:embed="rId28"/>
+                    <a:blip r:embed="rId29"/>
                     <a:stretch>
                       <a:fillRect/>
                     </a:stretch>
@@ -1780,7 +1881,7 @@
                     <pic:cNvPicPr/>
                   </pic:nvPicPr>
                   <pic:blipFill>
-                    <a:blip r:embed="rId29"/>
+                    <a:blip r:embed="rId30"/>
                     <a:stretch>
                       <a:fillRect/>
                     </a:stretch>
@@ -1843,7 +1944,7 @@
                     <pic:cNvPicPr/>
                   </pic:nvPicPr>
                   <pic:blipFill>
-                    <a:blip r:embed="rId30"/>
+                    <a:blip r:embed="rId31"/>
                     <a:stretch>
                       <a:fillRect/>
                     </a:stretch>
@@ -1906,7 +2007,7 @@
                     <pic:cNvPicPr/>
                   </pic:nvPicPr>
                   <pic:blipFill>
-                    <a:blip r:embed="rId31"/>
+                    <a:blip r:embed="rId32"/>
                     <a:stretch>
                       <a:fillRect/>
                     </a:stretch>
@@ -2023,11 +2124,6 @@
       </w:r>
     </w:p>
     <w:p>
-      <w:pPr>
-        <w:rPr>
-          <w:rFonts w:hint="eastAsia"/>
-        </w:rPr>
-      </w:pPr>
       <w:r>
         <w:rPr>
           <w:rFonts w:hint="eastAsia"/>

</xml_diff>

<commit_message>
problem 5.13 and add notes of the part 3 of the arch lab
</commit_message>
<xml_diff>
--- a/CSAPP/Tutorials/Screenshots of Figures of CSAPP2e.docx
+++ b/CSAPP/Tutorials/Screenshots of Figures of CSAPP2e.docx
@@ -427,11 +427,26 @@
           <w:tab w:val="center" w:pos="4153"/>
         </w:tabs>
       </w:pPr>
-      <w:r>
-        <w:rPr>
-          <w:rFonts w:hint="eastAsia"/>
-        </w:rPr>
-        <w:t>movabs $0x400921fb4d12d84a, $ea</w:t>
+      <w:proofErr w:type="spellStart"/>
+      <w:r>
+        <w:rPr>
+          <w:rFonts w:hint="eastAsia"/>
+        </w:rPr>
+        <w:t>movabs</w:t>
+      </w:r>
+      <w:proofErr w:type="spellEnd"/>
+      <w:r>
+        <w:rPr>
+          <w:rFonts w:hint="eastAsia"/>
+        </w:rPr>
+        <w:t xml:space="preserve"> $0x400921fb4d12d84a, $</w:t>
+      </w:r>
+      <w:proofErr w:type="spellStart"/>
+      <w:r>
+        <w:rPr>
+          <w:rFonts w:hint="eastAsia"/>
+        </w:rPr>
+        <w:t>ea</w:t>
       </w:r>
       <w:r>
         <w:rPr>
@@ -439,6 +454,7 @@
         </w:rPr>
         <w:t>x</w:t>
       </w:r>
+      <w:proofErr w:type="spellEnd"/>
     </w:p>
     <w:p>
       <w:pPr>
@@ -446,11 +462,19 @@
           <w:tab w:val="center" w:pos="4153"/>
         </w:tabs>
       </w:pPr>
-      <w:r>
-        <w:rPr>
-          <w:rFonts w:hint="eastAsia"/>
-        </w:rPr>
-        <w:t xml:space="preserve">movabs: move a full 64-bit value or a 64-bit absolute memory address. </w:t>
+      <w:proofErr w:type="spellStart"/>
+      <w:r>
+        <w:rPr>
+          <w:rFonts w:hint="eastAsia"/>
+        </w:rPr>
+        <w:t>movabs</w:t>
+      </w:r>
+      <w:proofErr w:type="spellEnd"/>
+      <w:r>
+        <w:rPr>
+          <w:rFonts w:hint="eastAsia"/>
+        </w:rPr>
+        <w:t xml:space="preserve">: move a full 64-bit value or a 64-bit absolute memory address. </w:t>
       </w:r>
     </w:p>
     <w:p>
@@ -516,7 +540,7 @@
       <w:pPr>
         <w:outlineLvl w:val="1"/>
         <w:rPr>
-          <w:rFonts w:ascii="Times New Roman" w:hAnsi="Times New Roman" w:cs="Times New Roman" w:hint="eastAsia"/>
+          <w:rFonts w:ascii="Times New Roman" w:hAnsi="Times New Roman" w:cs="Times New Roman"/>
           <w:b/>
           <w:sz w:val="24"/>
         </w:rPr>
@@ -1188,6 +1212,7 @@
         </w:rPr>
         <w:t>“</w:t>
       </w:r>
+      <w:proofErr w:type="spellStart"/>
       <w:r>
         <w:rPr>
           <w:rFonts w:hint="eastAsia"/>
@@ -1195,6 +1220,7 @@
         </w:rPr>
         <w:t>movl</w:t>
       </w:r>
+      <w:proofErr w:type="spellEnd"/>
       <w:r>
         <w:rPr>
           <w:b/>
@@ -1613,16 +1639,15 @@
           <w:b/>
           <w:bCs/>
         </w:rPr>
-        <w:t xml:space="preserve">Conditional </w:t>
-      </w:r>
-      <w:proofErr w:type="gramStart"/>
+        <w:t>Conditional Moves</w:t>
+      </w:r>
       <w:r>
         <w:rPr>
           <w:rFonts w:hint="eastAsia"/>
           <w:b/>
           <w:bCs/>
         </w:rPr>
-        <w:t>Moves</w:t>
+        <w:t xml:space="preserve"> </w:t>
       </w:r>
       <w:r>
         <w:rPr>
@@ -1630,16 +1655,7 @@
           <w:b/>
           <w:bCs/>
         </w:rPr>
-        <w:t>(</w:t>
-      </w:r>
-      <w:proofErr w:type="gramEnd"/>
-      <w:r>
-        <w:rPr>
-          <w:rFonts w:hint="eastAsia"/>
-          <w:b/>
-          <w:bCs/>
-        </w:rPr>
-        <w:t>The is no figure for this instruction, it is a practice probl</w:t>
+        <w:t>(The is no figure for this instruction, it is a practice probl</w:t>
       </w:r>
       <w:r>
         <w:rPr>
@@ -2038,12 +2054,14 @@
       <w:r>
         <w:t>“</w:t>
       </w:r>
+      <w:proofErr w:type="spellStart"/>
       <w:r>
         <w:rPr>
           <w:rFonts w:hint="eastAsia"/>
         </w:rPr>
         <w:t>m_stat</w:t>
       </w:r>
+      <w:proofErr w:type="spellEnd"/>
       <w:r>
         <w:t>”</w:t>
       </w:r>
@@ -2089,12 +2107,14 @@
       <w:r>
         <w:t>“</w:t>
       </w:r>
+      <w:proofErr w:type="spellStart"/>
       <w:r>
         <w:rPr>
           <w:rFonts w:hint="eastAsia"/>
         </w:rPr>
         <w:t>w_stat</w:t>
       </w:r>
+      <w:proofErr w:type="spellEnd"/>
       <w:r>
         <w:t>”</w:t>
       </w:r>
@@ -2142,12 +2162,14 @@
       <w:r>
         <w:t>“</w:t>
       </w:r>
+      <w:proofErr w:type="spellStart"/>
       <w:r>
         <w:rPr>
           <w:rFonts w:hint="eastAsia"/>
         </w:rPr>
         <w:t>W_stat</w:t>
       </w:r>
+      <w:proofErr w:type="spellEnd"/>
       <w:r>
         <w:t>”</w:t>
       </w:r>
@@ -2160,12 +2182,14 @@
       <w:r>
         <w:t>“</w:t>
       </w:r>
+      <w:proofErr w:type="spellStart"/>
       <w:r>
         <w:rPr>
           <w:rFonts w:hint="eastAsia"/>
         </w:rPr>
         <w:t>m_stat</w:t>
       </w:r>
+      <w:proofErr w:type="spellEnd"/>
       <w:r>
         <w:t>”</w:t>
       </w:r>
@@ -2178,12 +2202,14 @@
       <w:r>
         <w:t>“</w:t>
       </w:r>
+      <w:proofErr w:type="spellStart"/>
       <w:r>
         <w:rPr>
           <w:rFonts w:hint="eastAsia"/>
         </w:rPr>
         <w:t>M_stat</w:t>
       </w:r>
+      <w:proofErr w:type="spellEnd"/>
       <w:r>
         <w:t>”</w:t>
       </w:r>
@@ -2192,6 +2218,141 @@
           <w:rFonts w:hint="eastAsia"/>
         </w:rPr>
         <w:t xml:space="preserve"> is the value in the pipeline register M.</w:t>
+      </w:r>
+    </w:p>
+    <w:p>
+      <w:pPr>
+        <w:outlineLvl w:val="2"/>
+        <w:rPr>
+          <w:rFonts w:ascii="Times New Roman" w:hAnsi="Times New Roman" w:cs="Times New Roman"/>
+          <w:b/>
+          <w:sz w:val="24"/>
+          <w:szCs w:val="24"/>
+        </w:rPr>
+      </w:pPr>
+      <w:r>
+        <w:rPr>
+          <w:rFonts w:ascii="Times New Roman" w:hAnsi="Times New Roman" w:cs="Times New Roman" w:hint="eastAsia"/>
+          <w:b/>
+          <w:sz w:val="24"/>
+          <w:szCs w:val="24"/>
+        </w:rPr>
+        <w:t xml:space="preserve">Figure 4.55 </w:t>
+      </w:r>
+      <w:r>
+        <w:rPr>
+          <w:rFonts w:ascii="Times New Roman" w:hAnsi="Times New Roman" w:cs="Times New Roman"/>
+          <w:b/>
+          <w:sz w:val="24"/>
+          <w:szCs w:val="24"/>
+        </w:rPr>
+        <w:t>PIPE PC selection and fetch logic</w:t>
+      </w:r>
+    </w:p>
+    <w:p>
+      <w:r>
+        <w:rPr>
+          <w:noProof/>
+        </w:rPr>
+        <w:lastRenderedPageBreak/>
+        <w:drawing>
+          <wp:inline distT="0" distB="0" distL="0" distR="0" wp14:anchorId="6271289E" wp14:editId="31B1C0EB">
+            <wp:extent cx="5274310" cy="4053205"/>
+            <wp:effectExtent l="0" t="0" r="2540" b="4445"/>
+            <wp:docPr id="957142116" name="Picture 1"/>
+            <wp:cNvGraphicFramePr>
+              <a:graphicFrameLocks xmlns:a="http://schemas.openxmlformats.org/drawingml/2006/main" noChangeAspect="1"/>
+            </wp:cNvGraphicFramePr>
+            <a:graphic xmlns:a="http://schemas.openxmlformats.org/drawingml/2006/main">
+              <a:graphicData uri="http://schemas.openxmlformats.org/drawingml/2006/picture">
+                <pic:pic xmlns:pic="http://schemas.openxmlformats.org/drawingml/2006/picture">
+                  <pic:nvPicPr>
+                    <pic:cNvPr id="957142116" name=""/>
+                    <pic:cNvPicPr/>
+                  </pic:nvPicPr>
+                  <pic:blipFill>
+                    <a:blip r:embed="rId33"/>
+                    <a:stretch>
+                      <a:fillRect/>
+                    </a:stretch>
+                  </pic:blipFill>
+                  <pic:spPr>
+                    <a:xfrm>
+                      <a:off x="0" y="0"/>
+                      <a:ext cx="5274310" cy="4053205"/>
+                    </a:xfrm>
+                    <a:prstGeom prst="rect">
+                      <a:avLst/>
+                    </a:prstGeom>
+                  </pic:spPr>
+                </pic:pic>
+              </a:graphicData>
+            </a:graphic>
+          </wp:inline>
+        </w:drawing>
+      </w:r>
+    </w:p>
+    <w:p>
+      <w:pPr>
+        <w:outlineLvl w:val="2"/>
+        <w:rPr>
+          <w:rFonts w:ascii="Times New Roman" w:hAnsi="Times New Roman" w:cs="Times New Roman"/>
+          <w:b/>
+          <w:sz w:val="24"/>
+          <w:szCs w:val="24"/>
+        </w:rPr>
+      </w:pPr>
+      <w:r>
+        <w:rPr>
+          <w:rFonts w:ascii="Times New Roman" w:hAnsi="Times New Roman" w:cs="Times New Roman"/>
+          <w:b/>
+          <w:sz w:val="24"/>
+          <w:szCs w:val="24"/>
+        </w:rPr>
+        <w:t>Figure 4.56 PIPE decode and write-back stage logic.</w:t>
+      </w:r>
+    </w:p>
+    <w:p>
+      <w:r>
+        <w:rPr>
+          <w:noProof/>
+        </w:rPr>
+        <w:lastRenderedPageBreak/>
+        <w:drawing>
+          <wp:inline distT="0" distB="0" distL="0" distR="0" wp14:anchorId="771765AE" wp14:editId="10B7CD7F">
+            <wp:extent cx="5274310" cy="4587240"/>
+            <wp:effectExtent l="0" t="0" r="2540" b="3810"/>
+            <wp:docPr id="1025998542" name="Picture 1"/>
+            <wp:cNvGraphicFramePr>
+              <a:graphicFrameLocks xmlns:a="http://schemas.openxmlformats.org/drawingml/2006/main" noChangeAspect="1"/>
+            </wp:cNvGraphicFramePr>
+            <a:graphic xmlns:a="http://schemas.openxmlformats.org/drawingml/2006/main">
+              <a:graphicData uri="http://schemas.openxmlformats.org/drawingml/2006/picture">
+                <pic:pic xmlns:pic="http://schemas.openxmlformats.org/drawingml/2006/picture">
+                  <pic:nvPicPr>
+                    <pic:cNvPr id="1025998542" name=""/>
+                    <pic:cNvPicPr/>
+                  </pic:nvPicPr>
+                  <pic:blipFill>
+                    <a:blip r:embed="rId34"/>
+                    <a:stretch>
+                      <a:fillRect/>
+                    </a:stretch>
+                  </pic:blipFill>
+                  <pic:spPr>
+                    <a:xfrm>
+                      <a:off x="0" y="0"/>
+                      <a:ext cx="5274310" cy="4587240"/>
+                    </a:xfrm>
+                    <a:prstGeom prst="rect">
+                      <a:avLst/>
+                    </a:prstGeom>
+                  </pic:spPr>
+                </pic:pic>
+              </a:graphicData>
+            </a:graphic>
+          </wp:inline>
+        </w:drawing>
       </w:r>
     </w:p>
     <w:sectPr>
@@ -2606,7 +2767,6 @@
   <w:style w:type="character" w:default="1" w:styleId="DefaultParagraphFont">
     <w:name w:val="Default Paragraph Font"/>
     <w:uiPriority w:val="1"/>
-    <w:semiHidden/>
     <w:unhideWhenUsed/>
   </w:style>
   <w:style w:type="table" w:default="1" w:styleId="TableNormal">

</xml_diff>

<commit_message>
udpate note of part 3 fo the arch lab
</commit_message>
<xml_diff>
--- a/CSAPP/Tutorials/Screenshots of Figures of CSAPP2e.docx
+++ b/CSAPP/Tutorials/Screenshots of Figures of CSAPP2e.docx
@@ -2343,6 +2343,68 @@
                     <a:xfrm>
                       <a:off x="0" y="0"/>
                       <a:ext cx="5274310" cy="4587240"/>
+                    </a:xfrm>
+                    <a:prstGeom prst="rect">
+                      <a:avLst/>
+                    </a:prstGeom>
+                  </pic:spPr>
+                </pic:pic>
+              </a:graphicData>
+            </a:graphic>
+          </wp:inline>
+        </w:drawing>
+      </w:r>
+    </w:p>
+    <w:p>
+      <w:pPr>
+        <w:outlineLvl w:val="2"/>
+        <w:rPr>
+          <w:rFonts w:ascii="Times New Roman" w:hAnsi="Times New Roman" w:cs="Times New Roman"/>
+          <w:b/>
+          <w:sz w:val="24"/>
+          <w:szCs w:val="24"/>
+        </w:rPr>
+      </w:pPr>
+      <w:r>
+        <w:rPr>
+          <w:rFonts w:ascii="Times New Roman" w:hAnsi="Times New Roman" w:cs="Times New Roman"/>
+          <w:b/>
+          <w:sz w:val="24"/>
+          <w:szCs w:val="24"/>
+        </w:rPr>
+        <w:t>Figure 4.58 PIPE execute stage logic</w:t>
+      </w:r>
+    </w:p>
+    <w:p>
+      <w:r>
+        <w:rPr>
+          <w:noProof/>
+        </w:rPr>
+        <w:drawing>
+          <wp:inline distT="0" distB="0" distL="0" distR="0" wp14:anchorId="3CB048C1" wp14:editId="631C67A7">
+            <wp:extent cx="5274310" cy="3022600"/>
+            <wp:effectExtent l="0" t="0" r="2540" b="6350"/>
+            <wp:docPr id="1913235262" name="Picture 1"/>
+            <wp:cNvGraphicFramePr>
+              <a:graphicFrameLocks xmlns:a="http://schemas.openxmlformats.org/drawingml/2006/main" noChangeAspect="1"/>
+            </wp:cNvGraphicFramePr>
+            <a:graphic xmlns:a="http://schemas.openxmlformats.org/drawingml/2006/main">
+              <a:graphicData uri="http://schemas.openxmlformats.org/drawingml/2006/picture">
+                <pic:pic xmlns:pic="http://schemas.openxmlformats.org/drawingml/2006/picture">
+                  <pic:nvPicPr>
+                    <pic:cNvPr id="1913235262" name=""/>
+                    <pic:cNvPicPr/>
+                  </pic:nvPicPr>
+                  <pic:blipFill>
+                    <a:blip r:embed="rId35"/>
+                    <a:stretch>
+                      <a:fillRect/>
+                    </a:stretch>
+                  </pic:blipFill>
+                  <pic:spPr>
+                    <a:xfrm>
+                      <a:off x="0" y="0"/>
+                      <a:ext cx="5274310" cy="3022600"/>
                     </a:xfrm>
                     <a:prstGeom prst="rect">
                       <a:avLst/>

</xml_diff>